<commit_message>
Just added new programs
</commit_message>
<xml_diff>
--- a/New Microsoft Word Document.docx
+++ b/New Microsoft Word Document.docx
@@ -1,6 +1,6 @@
 
 <file path=word/document.xml><?xml version="1.0" encoding="utf-8"?>
-<w:document xmlns:wpc="http://schemas.microsoft.com/office/word/2010/wordprocessingCanvas" xmlns:cx="http://schemas.microsoft.com/office/drawing/2014/chartex" xmlns:cx1="http://schemas.microsoft.com/office/drawing/2015/9/8/chartex" xmlns:cx2="http://schemas.microsoft.com/office/drawing/2015/10/21/chartex" xmlns:cx3="http://schemas.microsoft.com/office/drawing/2016/5/9/chartex" xmlns:cx4="http://schemas.microsoft.com/office/drawing/2016/5/10/chartex" xmlns:cx5="http://schemas.microsoft.com/office/drawing/2016/5/11/chartex" xmlns:cx6="http://schemas.microsoft.com/office/drawing/2016/5/12/chartex" xmlns:cx7="http://schemas.microsoft.com/office/drawing/2016/5/13/chartex" xmlns:cx8="http://schemas.microsoft.com/office/drawing/2016/5/14/chartex" xmlns:mc="http://schemas.openxmlformats.org/markup-compatibility/2006" xmlns:aink="http://schemas.microsoft.com/office/drawing/2016/ink" xmlns:am3d="http://schemas.microsoft.com/office/drawing/2017/model3d" xmlns:o="urn:schemas-microsoft-com:office:office" xmlns:oel="http://schemas.microsoft.com/office/2019/extlst" xmlns:r="http://schemas.openxmlformats.org/officeDocument/2006/relationships" xmlns:m="http://schemas.openxmlformats.org/officeDocument/2006/math" xmlns:v="urn:schemas-microsoft-com:vml" xmlns:wp14="http://schemas.microsoft.com/office/word/2010/wordprocessingDrawing" xmlns:wp="http://schemas.openxmlformats.org/drawingml/2006/wordprocessingDrawing" xmlns:w10="urn:schemas-microsoft-com:office:word" xmlns:w="http://schemas.openxmlformats.org/wordprocessingml/2006/main" xmlns:w14="http://schemas.microsoft.com/office/word/2010/wordml" xmlns:w15="http://schemas.microsoft.com/office/word/2012/wordml" xmlns:w16cex="http://schemas.microsoft.com/office/word/2018/wordml/cex" xmlns:w16cid="http://schemas.microsoft.com/office/word/2016/wordml/cid" xmlns:w16="http://schemas.microsoft.com/office/word/2018/wordml" xmlns:w16du="http://schemas.microsoft.com/office/word/2023/wordml/word16du" xmlns:w16sdtdh="http://schemas.microsoft.com/office/word/2020/wordml/sdtdatahash" xmlns:w16sdtfl="http://schemas.microsoft.com/office/word/2024/wordml/sdtformatlock" xmlns:w16se="http://schemas.microsoft.com/office/word/2015/wordml/symex" xmlns:wpg="http://schemas.microsoft.com/office/word/2010/wordprocessingGroup" xmlns:wpi="http://schemas.microsoft.com/office/word/2010/wordprocessingInk" xmlns:wne="http://schemas.microsoft.com/office/word/2006/wordml" xmlns:wps="http://schemas.microsoft.com/office/word/2010/wordprocessingShape" mc:Ignorable="w14 w15 w16se w16cid w16 w16cex w16sdtdh w16sdtfl w16du wp14">
+<w:document xmlns:wpc="http://schemas.microsoft.com/office/word/2010/wordprocessingCanvas" xmlns:cx="http://schemas.microsoft.com/office/drawing/2014/chartex" xmlns:cx1="http://schemas.microsoft.com/office/drawing/2015/9/8/chartex" xmlns:cx2="http://schemas.microsoft.com/office/drawing/2015/10/21/chartex" xmlns:cx3="http://schemas.microsoft.com/office/drawing/2016/5/9/chartex" xmlns:cx4="http://schemas.microsoft.com/office/drawing/2016/5/10/chartex" xmlns:cx5="http://schemas.microsoft.com/office/drawing/2016/5/11/chartex" xmlns:cx6="http://schemas.microsoft.com/office/drawing/2016/5/12/chartex" xmlns:cx7="http://schemas.microsoft.com/office/drawing/2016/5/13/chartex" xmlns:cx8="http://schemas.microsoft.com/office/drawing/2016/5/14/chartex" xmlns:mc="http://schemas.openxmlformats.org/markup-compatibility/2006" xmlns:aink="http://schemas.microsoft.com/office/drawing/2016/ink" xmlns:am3d="http://schemas.microsoft.com/office/drawing/2017/model3d" xmlns:o="urn:schemas-microsoft-com:office:office" xmlns:oel="http://schemas.microsoft.com/office/2019/extlst" xmlns:r="http://schemas.openxmlformats.org/officeDocument/2006/relationships" xmlns:m="http://schemas.openxmlformats.org/officeDocument/2006/math" xmlns:v="urn:schemas-microsoft-com:vml" xmlns:wp14="http://schemas.microsoft.com/office/word/2010/wordprocessingDrawing" xmlns:wp="http://schemas.openxmlformats.org/drawingml/2006/wordprocessingDrawing" xmlns:w10="urn:schemas-microsoft-com:office:word" xmlns:w="http://schemas.openxmlformats.org/wordprocessingml/2006/main" xmlns:w14="http://schemas.microsoft.com/office/word/2010/wordml" xmlns:w15="http://schemas.microsoft.com/office/word/2012/wordml" xmlns:w16cei="http://schemas.microsoft.com/office/word/2026/wordml/cei" xmlns:w16cex="http://schemas.microsoft.com/office/word/2018/wordml/cex" xmlns:w16cid="http://schemas.microsoft.com/office/word/2016/wordml/cid" xmlns:w16="http://schemas.microsoft.com/office/word/2018/wordml" xmlns:w16du="http://schemas.microsoft.com/office/word/2023/wordml/word16du" xmlns:w16sdtdh="http://schemas.microsoft.com/office/word/2020/wordml/sdtdatahash" xmlns:w16sdtfl="http://schemas.microsoft.com/office/word/2024/wordml/sdtformatlock" xmlns:w16se="http://schemas.microsoft.com/office/word/2015/wordml/symex" xmlns:wpg="http://schemas.microsoft.com/office/word/2010/wordprocessingGroup" xmlns:wpi="http://schemas.microsoft.com/office/word/2010/wordprocessingInk" xmlns:wne="http://schemas.microsoft.com/office/word/2006/wordml" xmlns:wps="http://schemas.microsoft.com/office/word/2010/wordprocessingShape" mc:Ignorable="w14 w15 w16se w16cid w16 w16cex w16sdtdh w16sdtfl w16du wp14">
   <w:body>
     <w:p>
       <w:pPr>
@@ -72,7 +72,7 @@
           <w:sz w:val="44"/>
           <w:szCs w:val="44"/>
         </w:rPr>
-        <w:t>3</w:t>
+        <w:t>4</w:t>
       </w:r>
     </w:p>
     <w:p>
@@ -130,7 +130,7 @@
           <w:sz w:val="36"/>
           <w:szCs w:val="36"/>
         </w:rPr>
-        <w:t>3</w:t>
+        <w:t>4</w:t>
       </w:r>
       <w:r>
         <w:rPr>
@@ -144,21 +144,21 @@
           <w:sz w:val="36"/>
           <w:szCs w:val="36"/>
         </w:rPr>
-        <w:t xml:space="preserve"> Control</w:t>
+        <w:t xml:space="preserve"> </w:t>
       </w:r>
       <w:r>
         <w:rPr>
           <w:sz w:val="36"/>
           <w:szCs w:val="36"/>
         </w:rPr>
-        <w:t xml:space="preserve"> statements</w:t>
+        <w:t xml:space="preserve">Patterns and </w:t>
       </w:r>
       <w:r>
         <w:rPr>
           <w:sz w:val="36"/>
           <w:szCs w:val="36"/>
         </w:rPr>
-        <w:t>.</w:t>
+        <w:t>Lists in python</w:t>
       </w:r>
     </w:p>
     <w:p>
@@ -211,7 +211,6 @@
                 <w:szCs w:val="36"/>
               </w:rPr>
             </w:pPr>
-            <w:proofErr w:type="spellStart"/>
             <w:r>
               <w:rPr>
                 <w:sz w:val="36"/>
@@ -219,7 +218,6 @@
               </w:rPr>
               <w:t>C.Pranaveswar</w:t>
             </w:r>
-            <w:proofErr w:type="spellEnd"/>
           </w:p>
         </w:tc>
       </w:tr>
@@ -386,7 +384,14 @@
                 <w:sz w:val="36"/>
                 <w:szCs w:val="36"/>
               </w:rPr>
-              <w:t>25</w:t>
+              <w:t>2</w:t>
+            </w:r>
+            <w:r>
+              <w:rPr>
+                <w:sz w:val="36"/>
+                <w:szCs w:val="36"/>
+              </w:rPr>
+              <w:t>8</w:t>
             </w:r>
             <w:r>
               <w:rPr>
@@ -489,7 +494,7 @@
                 <w:sz w:val="28"/>
                 <w:szCs w:val="28"/>
               </w:rPr>
-              <w:t>5</w:t>
+              <w:t>8</w:t>
             </w:r>
             <w:r>
               <w:rPr>
@@ -531,6 +536,21 @@
           </w:tcPr>
           <w:p>
             <w:pPr>
+              <w:rPr>
+                <w:sz w:val="36"/>
+                <w:szCs w:val="36"/>
+              </w:rPr>
+            </w:pPr>
+            <w:r>
+              <w:rPr>
+                <w:sz w:val="36"/>
+                <w:szCs w:val="36"/>
+              </w:rPr>
+              <w:t>Patterns and Lists in python</w:t>
+            </w:r>
+          </w:p>
+          <w:p>
+            <w:pPr>
               <w:tabs>
                 <w:tab w:val="left" w:pos="3110"/>
               </w:tabs>
@@ -539,13 +559,6 @@
                 <w:szCs w:val="28"/>
               </w:rPr>
             </w:pPr>
-            <w:r>
-              <w:rPr>
-                <w:sz w:val="28"/>
-                <w:szCs w:val="28"/>
-              </w:rPr>
-              <w:t>Control statements</w:t>
-            </w:r>
           </w:p>
         </w:tc>
       </w:tr>
@@ -599,7 +612,14 @@
                 <w:sz w:val="28"/>
                 <w:szCs w:val="28"/>
               </w:rPr>
-              <w:t xml:space="preserve">Control statements </w:t>
+              <w:t>the print</w:t>
+            </w:r>
+            <w:r>
+              <w:rPr>
+                <w:sz w:val="28"/>
+                <w:szCs w:val="28"/>
+              </w:rPr>
+              <w:t xml:space="preserve">ing of different patterns and Lists in python </w:t>
             </w:r>
             <w:r>
               <w:rPr>
@@ -685,442 +705,6 @@
     </w:p>
     <w:p>
       <w:pPr>
-        <w:numPr>
-          <w:ilvl w:val="0"/>
-          <w:numId w:val="2"/>
-        </w:numPr>
-        <w:rPr>
-          <w:sz w:val="28"/>
-          <w:szCs w:val="28"/>
-        </w:rPr>
-      </w:pPr>
-      <w:r>
-        <w:rPr>
-          <w:sz w:val="28"/>
-          <w:szCs w:val="28"/>
-        </w:rPr>
-        <w:t>1.</w:t>
-      </w:r>
-      <w:r>
-        <w:rPr>
-          <w:sz w:val="24"/>
-          <w:szCs w:val="24"/>
-        </w:rPr>
-        <w:t xml:space="preserve"> </w:t>
-      </w:r>
-      <w:r>
-        <w:rPr>
-          <w:sz w:val="28"/>
-          <w:szCs w:val="28"/>
-        </w:rPr>
-        <w:t>Write a Python program using a while loop to simulate a bus ticket booking counter with the following requirements:</w:t>
-      </w:r>
-    </w:p>
-    <w:p>
-      <w:pPr>
-        <w:numPr>
-          <w:ilvl w:val="0"/>
-          <w:numId w:val="3"/>
-        </w:numPr>
-        <w:tabs>
-          <w:tab w:val="num" w:pos="720"/>
-        </w:tabs>
-        <w:rPr>
-          <w:sz w:val="28"/>
-          <w:szCs w:val="28"/>
-        </w:rPr>
-      </w:pPr>
-      <w:r>
-        <w:rPr>
-          <w:sz w:val="28"/>
-          <w:szCs w:val="28"/>
-        </w:rPr>
-        <w:t xml:space="preserve">The bus has a total capacity of </w:t>
-      </w:r>
-      <w:r>
-        <w:rPr>
-          <w:b/>
-          <w:bCs/>
-          <w:sz w:val="28"/>
-          <w:szCs w:val="28"/>
-        </w:rPr>
-        <w:t>40 seats</w:t>
-      </w:r>
-      <w:r>
-        <w:rPr>
-          <w:sz w:val="28"/>
-          <w:szCs w:val="28"/>
-        </w:rPr>
-        <w:t>.</w:t>
-      </w:r>
-    </w:p>
-    <w:p>
-      <w:pPr>
-        <w:numPr>
-          <w:ilvl w:val="0"/>
-          <w:numId w:val="3"/>
-        </w:numPr>
-        <w:tabs>
-          <w:tab w:val="num" w:pos="720"/>
-        </w:tabs>
-        <w:rPr>
-          <w:sz w:val="28"/>
-          <w:szCs w:val="28"/>
-        </w:rPr>
-      </w:pPr>
-      <w:r>
-        <w:rPr>
-          <w:sz w:val="28"/>
-          <w:szCs w:val="28"/>
-        </w:rPr>
-        <w:t>The program should keep asking the user how many tickets they want to book, until they choose to exit (by entering 0).</w:t>
-      </w:r>
-    </w:p>
-    <w:p>
-      <w:pPr>
-        <w:numPr>
-          <w:ilvl w:val="0"/>
-          <w:numId w:val="3"/>
-        </w:numPr>
-        <w:tabs>
-          <w:tab w:val="num" w:pos="720"/>
-        </w:tabs>
-        <w:rPr>
-          <w:sz w:val="28"/>
-          <w:szCs w:val="28"/>
-        </w:rPr>
-      </w:pPr>
-      <w:r>
-        <w:rPr>
-          <w:sz w:val="28"/>
-          <w:szCs w:val="28"/>
-        </w:rPr>
-        <w:t xml:space="preserve">For each booking request: </w:t>
-      </w:r>
-    </w:p>
-    <w:p>
-      <w:pPr>
-        <w:numPr>
-          <w:ilvl w:val="1"/>
-          <w:numId w:val="3"/>
-        </w:numPr>
-        <w:tabs>
-          <w:tab w:val="clear" w:pos="2160"/>
-          <w:tab w:val="num" w:pos="1440"/>
-        </w:tabs>
-        <w:rPr>
-          <w:sz w:val="28"/>
-          <w:szCs w:val="28"/>
-        </w:rPr>
-      </w:pPr>
-      <w:r>
-        <w:rPr>
-          <w:sz w:val="28"/>
-          <w:szCs w:val="28"/>
-        </w:rPr>
-        <w:lastRenderedPageBreak/>
-        <w:t xml:space="preserve">If the requested number of tickets is </w:t>
-      </w:r>
-      <w:r>
-        <w:rPr>
-          <w:b/>
-          <w:bCs/>
-          <w:sz w:val="28"/>
-          <w:szCs w:val="28"/>
-        </w:rPr>
-        <w:t>available</w:t>
-      </w:r>
-      <w:r>
-        <w:rPr>
-          <w:sz w:val="28"/>
-          <w:szCs w:val="28"/>
-        </w:rPr>
-        <w:t>, confirm the booking and reduce the available seat count.</w:t>
-      </w:r>
-    </w:p>
-    <w:p>
-      <w:pPr>
-        <w:numPr>
-          <w:ilvl w:val="1"/>
-          <w:numId w:val="3"/>
-        </w:numPr>
-        <w:tabs>
-          <w:tab w:val="clear" w:pos="2160"/>
-          <w:tab w:val="num" w:pos="1440"/>
-        </w:tabs>
-        <w:rPr>
-          <w:sz w:val="28"/>
-          <w:szCs w:val="28"/>
-        </w:rPr>
-      </w:pPr>
-      <w:r>
-        <w:rPr>
-          <w:sz w:val="28"/>
-          <w:szCs w:val="28"/>
-        </w:rPr>
-        <w:t xml:space="preserve">If the requested number </w:t>
-      </w:r>
-      <w:r>
-        <w:rPr>
-          <w:b/>
-          <w:bCs/>
-          <w:sz w:val="28"/>
-          <w:szCs w:val="28"/>
-        </w:rPr>
-        <w:t>exceeds available seats</w:t>
-      </w:r>
-      <w:r>
-        <w:rPr>
-          <w:sz w:val="28"/>
-          <w:szCs w:val="28"/>
-        </w:rPr>
-        <w:t>, display an appropriate message showing how many seats are actually left.</w:t>
-      </w:r>
-    </w:p>
-    <w:p>
-      <w:pPr>
-        <w:numPr>
-          <w:ilvl w:val="1"/>
-          <w:numId w:val="3"/>
-        </w:numPr>
-        <w:tabs>
-          <w:tab w:val="clear" w:pos="2160"/>
-          <w:tab w:val="num" w:pos="1440"/>
-        </w:tabs>
-        <w:rPr>
-          <w:sz w:val="28"/>
-          <w:szCs w:val="28"/>
-        </w:rPr>
-      </w:pPr>
-      <w:r>
-        <w:rPr>
-          <w:sz w:val="28"/>
-          <w:szCs w:val="28"/>
-        </w:rPr>
-        <w:t xml:space="preserve">If the bus becomes </w:t>
-      </w:r>
-      <w:r>
-        <w:rPr>
-          <w:b/>
-          <w:bCs/>
-          <w:sz w:val="28"/>
-          <w:szCs w:val="28"/>
-        </w:rPr>
-        <w:t>fully booked</w:t>
-      </w:r>
-      <w:r>
-        <w:rPr>
-          <w:sz w:val="28"/>
-          <w:szCs w:val="28"/>
-        </w:rPr>
-        <w:t>, display a "Bus Full" message and stop accepting further bookings automatically.</w:t>
-      </w:r>
-    </w:p>
-    <w:p>
-      <w:pPr>
-        <w:numPr>
-          <w:ilvl w:val="0"/>
-          <w:numId w:val="3"/>
-        </w:numPr>
-        <w:tabs>
-          <w:tab w:val="num" w:pos="720"/>
-        </w:tabs>
-        <w:rPr>
-          <w:sz w:val="28"/>
-          <w:szCs w:val="28"/>
-        </w:rPr>
-      </w:pPr>
-      <w:r>
-        <w:rPr>
-          <w:sz w:val="28"/>
-          <w:szCs w:val="28"/>
-        </w:rPr>
-        <w:t xml:space="preserve">At the end (whether by user exit or bus becoming full), display the </w:t>
-      </w:r>
-      <w:r>
-        <w:rPr>
-          <w:b/>
-          <w:bCs/>
-          <w:sz w:val="28"/>
-          <w:szCs w:val="28"/>
-        </w:rPr>
-        <w:t>total number of tickets sold</w:t>
-      </w:r>
-      <w:r>
-        <w:rPr>
-          <w:sz w:val="28"/>
-          <w:szCs w:val="28"/>
-        </w:rPr>
-        <w:t xml:space="preserve"> and the </w:t>
-      </w:r>
-      <w:r>
-        <w:rPr>
-          <w:b/>
-          <w:bCs/>
-          <w:sz w:val="28"/>
-          <w:szCs w:val="28"/>
-        </w:rPr>
-        <w:t>total seats remaining</w:t>
-      </w:r>
-      <w:r>
-        <w:rPr>
-          <w:sz w:val="28"/>
-          <w:szCs w:val="28"/>
-        </w:rPr>
-        <w:t>.</w:t>
-      </w:r>
-    </w:p>
-    <w:p>
-      <w:pPr>
-        <w:rPr>
-          <w:sz w:val="28"/>
-          <w:szCs w:val="28"/>
-        </w:rPr>
-      </w:pPr>
-      <w:r>
-        <w:rPr>
-          <w:sz w:val="28"/>
-          <w:szCs w:val="28"/>
-        </w:rPr>
-        <w:t>2.</w:t>
-      </w:r>
-      <w:r>
-        <w:rPr>
-          <w:sz w:val="24"/>
-          <w:szCs w:val="24"/>
-        </w:rPr>
-        <w:t xml:space="preserve"> </w:t>
-      </w:r>
-      <w:r>
-        <w:rPr>
-          <w:sz w:val="28"/>
-          <w:szCs w:val="28"/>
-        </w:rPr>
-        <w:t>Write a program using a while loop that allows a user a maximum of 3 attempts to enter the correct 4-digit ATM PIN. Display "Access Granted" on success. If all 3 attempts fail, display "Account Locked" and terminate.</w:t>
-      </w:r>
-    </w:p>
-    <w:p>
-      <w:pPr>
-        <w:rPr>
-          <w:sz w:val="28"/>
-          <w:szCs w:val="28"/>
-        </w:rPr>
-      </w:pPr>
-      <w:r>
-        <w:rPr>
-          <w:sz w:val="28"/>
-          <w:szCs w:val="28"/>
-        </w:rPr>
-        <w:t>3.</w:t>
-      </w:r>
-      <w:r>
-        <w:t xml:space="preserve"> </w:t>
-      </w:r>
-      <w:r>
-        <w:rPr>
-          <w:sz w:val="28"/>
-          <w:szCs w:val="28"/>
-        </w:rPr>
-        <w:t>Write a program using a while loop that generates a random number between 1 and 50 and allows the user to keep guessing until they guess correctly. After each guess, display whether the guess was too high or too low. Display the total number of attempts taken once the correct number is guessed.</w:t>
-      </w:r>
-    </w:p>
-    <w:p>
-      <w:pPr>
-        <w:rPr>
-          <w:b/>
-          <w:bCs/>
-          <w:sz w:val="28"/>
-          <w:szCs w:val="28"/>
-        </w:rPr>
-      </w:pPr>
-      <w:r>
-        <w:rPr>
-          <w:b/>
-          <w:bCs/>
-          <w:sz w:val="28"/>
-          <w:szCs w:val="28"/>
-        </w:rPr>
-        <w:t>4: Write a program using a while loop to manage a shop's inventory starting with 50 units in stock. The program should repeatedly accept the number of units sold, update the stock, and display a "Reorder Alert" when stock falls to 10 or below. The loop should terminate when the user enters -1 or stock reaches 0.</w:t>
-      </w:r>
-    </w:p>
-    <w:p>
-      <w:pPr>
-        <w:rPr>
-          <w:sz w:val="28"/>
-          <w:szCs w:val="28"/>
-        </w:rPr>
-      </w:pPr>
-    </w:p>
-    <w:p>
-      <w:pPr>
-        <w:rPr>
-          <w:sz w:val="36"/>
-          <w:szCs w:val="36"/>
-        </w:rPr>
-      </w:pPr>
-      <w:r>
-        <w:rPr>
-          <w:sz w:val="36"/>
-          <w:szCs w:val="36"/>
-        </w:rPr>
-        <w:t>Programs, Sample Outputs and Results</w:t>
-      </w:r>
-      <w:r>
-        <w:rPr>
-          <w:sz w:val="36"/>
-          <w:szCs w:val="36"/>
-        </w:rPr>
-        <w:t>:</w:t>
-      </w:r>
-    </w:p>
-    <w:p>
-      <w:pPr>
-        <w:tabs>
-          <w:tab w:val="left" w:pos="3110"/>
-        </w:tabs>
-        <w:rPr>
-          <w:sz w:val="28"/>
-          <w:szCs w:val="28"/>
-        </w:rPr>
-      </w:pPr>
-      <w:r>
-        <w:rPr>
-          <w:sz w:val="28"/>
-          <w:szCs w:val="28"/>
-        </w:rPr>
-        <w:t xml:space="preserve"> Question 1: </w:t>
-      </w:r>
-      <w:r>
-        <w:rPr>
-          <w:sz w:val="28"/>
-          <w:szCs w:val="28"/>
-        </w:rPr>
-        <w:t>Write a Python program using a while loop to simulate a bus ticket booking</w:t>
-      </w:r>
-    </w:p>
-    <w:p>
-      <w:pPr>
-        <w:tabs>
-          <w:tab w:val="left" w:pos="3110"/>
-        </w:tabs>
-        <w:rPr>
-          <w:sz w:val="28"/>
-          <w:szCs w:val="28"/>
-        </w:rPr>
-      </w:pPr>
-      <w:r>
-        <w:rPr>
-          <w:sz w:val="28"/>
-          <w:szCs w:val="28"/>
-        </w:rPr>
-        <w:t>Program:</w:t>
-      </w:r>
-    </w:p>
-    <w:p>
-      <w:pPr>
-        <w:tabs>
-          <w:tab w:val="left" w:pos="3110"/>
-        </w:tabs>
         <w:rPr>
           <w:sz w:val="28"/>
           <w:szCs w:val="28"/>
@@ -1133,10 +717,10 @@
         </w:rPr>
         <w:lastRenderedPageBreak/>
         <w:drawing>
-          <wp:inline distT="0" distB="0" distL="0" distR="0" wp14:anchorId="4D20EA3A" wp14:editId="47C73FF1">
-            <wp:extent cx="5731510" cy="2369820"/>
-            <wp:effectExtent l="0" t="0" r="2540" b="0"/>
-            <wp:docPr id="1530858336" name="Picture 1"/>
+          <wp:inline distT="0" distB="0" distL="0" distR="0" wp14:anchorId="4E96D15C" wp14:editId="58012E78">
+            <wp:extent cx="4731327" cy="2666548"/>
+            <wp:effectExtent l="0" t="0" r="0" b="635"/>
+            <wp:docPr id="307313778" name="Picture 1"/>
             <wp:cNvGraphicFramePr>
               <a:graphicFrameLocks xmlns:a="http://schemas.openxmlformats.org/drawingml/2006/main" noChangeAspect="1"/>
             </wp:cNvGraphicFramePr>
@@ -1144,7 +728,7 @@
               <a:graphicData uri="http://schemas.openxmlformats.org/drawingml/2006/picture">
                 <pic:pic xmlns:pic="http://schemas.openxmlformats.org/drawingml/2006/picture">
                   <pic:nvPicPr>
-                    <pic:cNvPr id="1530858336" name=""/>
+                    <pic:cNvPr id="307313778" name=""/>
                     <pic:cNvPicPr/>
                   </pic:nvPicPr>
                   <pic:blipFill>
@@ -1156,7 +740,7 @@
                   <pic:spPr>
                     <a:xfrm>
                       <a:off x="0" y="0"/>
-                      <a:ext cx="5731510" cy="2369820"/>
+                      <a:ext cx="4745973" cy="2674802"/>
                     </a:xfrm>
                     <a:prstGeom prst="rect">
                       <a:avLst/>
@@ -1171,6 +755,640 @@
     </w:p>
     <w:p>
       <w:pPr>
+        <w:rPr>
+          <w:sz w:val="28"/>
+          <w:szCs w:val="28"/>
+        </w:rPr>
+      </w:pPr>
+      <w:r>
+        <w:rPr>
+          <w:sz w:val="28"/>
+          <w:szCs w:val="28"/>
+        </w:rPr>
+        <w:t xml:space="preserve">Q2. Write a Python program to shift each character of a given string by one position in the ASCII sequence. </w:t>
+      </w:r>
+    </w:p>
+    <w:p>
+      <w:pPr>
+        <w:rPr>
+          <w:sz w:val="28"/>
+          <w:szCs w:val="28"/>
+        </w:rPr>
+      </w:pPr>
+      <w:r>
+        <w:rPr>
+          <w:sz w:val="28"/>
+          <w:szCs w:val="28"/>
+        </w:rPr>
+        <w:t>Q3. Write a Python program to read a specified number of elements from the user through the keyboard and store them in a list. The program should: 1. Prompt the user to enter the number of elements, n. 2. Use a loop to accept n elements one by one from the user. 3. Append each entered element to a list. 4. Display the final list after all elements have been entered.</w:t>
+      </w:r>
+    </w:p>
+    <w:p>
+      <w:pPr>
+        <w:rPr>
+          <w:sz w:val="28"/>
+          <w:szCs w:val="28"/>
+        </w:rPr>
+      </w:pPr>
+      <w:r>
+        <w:rPr>
+          <w:sz w:val="28"/>
+          <w:szCs w:val="28"/>
+        </w:rPr>
+        <w:t xml:space="preserve"> Q4. Write a Python program to read temperature values for each day of the week (Monday to Sunday) from the user and store them in a list. Find the maximum and minimum temperature recorded during the week, along with the day on which it occurred.</w:t>
+      </w:r>
+    </w:p>
+    <w:p>
+      <w:pPr>
+        <w:rPr>
+          <w:sz w:val="28"/>
+          <w:szCs w:val="28"/>
+        </w:rPr>
+      </w:pPr>
+      <w:r>
+        <w:rPr>
+          <w:sz w:val="28"/>
+          <w:szCs w:val="28"/>
+        </w:rPr>
+        <w:t xml:space="preserve"> Q5. Write a Python program to remove duplicate elements from a list by preserving the order.</w:t>
+      </w:r>
+    </w:p>
+    <w:p>
+      <w:pPr>
+        <w:rPr>
+          <w:sz w:val="28"/>
+          <w:szCs w:val="28"/>
+        </w:rPr>
+      </w:pPr>
+      <w:r>
+        <w:rPr>
+          <w:sz w:val="28"/>
+          <w:szCs w:val="28"/>
+        </w:rPr>
+        <w:t xml:space="preserve"> Q6. Create a program that manages a grocery shopping list. The program should:</w:t>
+      </w:r>
+    </w:p>
+    <w:p>
+      <w:pPr>
+        <w:rPr>
+          <w:sz w:val="28"/>
+          <w:szCs w:val="28"/>
+        </w:rPr>
+      </w:pPr>
+      <w:r>
+        <w:rPr>
+          <w:sz w:val="28"/>
+          <w:szCs w:val="28"/>
+        </w:rPr>
+        <w:t xml:space="preserve"> • Initialize a list with some grocery items. </w:t>
+      </w:r>
+    </w:p>
+    <w:p>
+      <w:pPr>
+        <w:rPr>
+          <w:sz w:val="28"/>
+          <w:szCs w:val="28"/>
+        </w:rPr>
+      </w:pPr>
+      <w:r>
+        <w:rPr>
+          <w:sz w:val="28"/>
+          <w:szCs w:val="28"/>
+        </w:rPr>
+        <w:t xml:space="preserve">• Add a new item to the list. </w:t>
+      </w:r>
+    </w:p>
+    <w:p>
+      <w:pPr>
+        <w:rPr>
+          <w:sz w:val="28"/>
+          <w:szCs w:val="28"/>
+        </w:rPr>
+      </w:pPr>
+      <w:r>
+        <w:rPr>
+          <w:sz w:val="28"/>
+          <w:szCs w:val="28"/>
+        </w:rPr>
+        <w:t>• Remove an item from the list.</w:t>
+      </w:r>
+    </w:p>
+    <w:p>
+      <w:pPr>
+        <w:rPr>
+          <w:sz w:val="28"/>
+          <w:szCs w:val="28"/>
+        </w:rPr>
+      </w:pPr>
+      <w:r>
+        <w:rPr>
+          <w:sz w:val="28"/>
+          <w:szCs w:val="28"/>
+        </w:rPr>
+        <w:t xml:space="preserve"> • Print the final shopping list.</w:t>
+      </w:r>
+    </w:p>
+    <w:p>
+      <w:pPr>
+        <w:rPr>
+          <w:sz w:val="28"/>
+          <w:szCs w:val="28"/>
+        </w:rPr>
+      </w:pPr>
+      <w:r>
+        <w:rPr>
+          <w:sz w:val="28"/>
+          <w:szCs w:val="28"/>
+        </w:rPr>
+        <w:t>Q</w:t>
+      </w:r>
+      <w:r>
+        <w:rPr>
+          <w:sz w:val="28"/>
+          <w:szCs w:val="28"/>
+        </w:rPr>
+        <w:t xml:space="preserve">7. </w:t>
+      </w:r>
+      <w:r>
+        <w:rPr>
+          <w:sz w:val="28"/>
+          <w:szCs w:val="28"/>
+        </w:rPr>
+        <w:t xml:space="preserve">Write a menu-driven Python program to manage a list of books in a library using built-in list methods (no user-defined functions). The program </w:t>
+      </w:r>
+      <w:r>
+        <w:rPr>
+          <w:sz w:val="28"/>
+          <w:szCs w:val="28"/>
+        </w:rPr>
+        <w:lastRenderedPageBreak/>
+        <w:t>should display a menu repeatedly (using a loop) and perform the operation selected by the user, until the user chooses to exit.</w:t>
+      </w:r>
+    </w:p>
+    <w:p>
+      <w:pPr>
+        <w:rPr>
+          <w:sz w:val="28"/>
+          <w:szCs w:val="28"/>
+        </w:rPr>
+      </w:pPr>
+    </w:p>
+    <w:p>
+      <w:pPr>
+        <w:rPr>
+          <w:sz w:val="28"/>
+          <w:szCs w:val="28"/>
+        </w:rPr>
+      </w:pPr>
+      <w:r>
+        <w:rPr>
+          <w:sz w:val="28"/>
+          <w:szCs w:val="28"/>
+        </w:rPr>
+        <w:t>Menu:</w:t>
+      </w:r>
+    </w:p>
+    <w:p>
+      <w:pPr>
+        <w:rPr>
+          <w:sz w:val="28"/>
+          <w:szCs w:val="28"/>
+        </w:rPr>
+      </w:pPr>
+    </w:p>
+    <w:p>
+      <w:pPr>
+        <w:rPr>
+          <w:sz w:val="28"/>
+          <w:szCs w:val="28"/>
+        </w:rPr>
+      </w:pPr>
+      <w:r>
+        <w:rPr>
+          <w:sz w:val="28"/>
+          <w:szCs w:val="28"/>
+        </w:rPr>
+        <w:t>Library Management System</w:t>
+      </w:r>
+    </w:p>
+    <w:p>
+      <w:pPr>
+        <w:rPr>
+          <w:sz w:val="28"/>
+          <w:szCs w:val="28"/>
+        </w:rPr>
+      </w:pPr>
+      <w:r>
+        <w:rPr>
+          <w:sz w:val="28"/>
+          <w:szCs w:val="28"/>
+        </w:rPr>
+        <w:t>1. Display all books</w:t>
+      </w:r>
+    </w:p>
+    <w:p>
+      <w:pPr>
+        <w:rPr>
+          <w:sz w:val="28"/>
+          <w:szCs w:val="28"/>
+        </w:rPr>
+      </w:pPr>
+      <w:r>
+        <w:rPr>
+          <w:sz w:val="28"/>
+          <w:szCs w:val="28"/>
+        </w:rPr>
+        <w:t>2. Add a new book</w:t>
+      </w:r>
+    </w:p>
+    <w:p>
+      <w:pPr>
+        <w:rPr>
+          <w:sz w:val="28"/>
+          <w:szCs w:val="28"/>
+        </w:rPr>
+      </w:pPr>
+      <w:r>
+        <w:rPr>
+          <w:sz w:val="28"/>
+          <w:szCs w:val="28"/>
+        </w:rPr>
+        <w:t>3. Insert a book at a specific position</w:t>
+      </w:r>
+    </w:p>
+    <w:p>
+      <w:pPr>
+        <w:rPr>
+          <w:sz w:val="28"/>
+          <w:szCs w:val="28"/>
+        </w:rPr>
+      </w:pPr>
+      <w:r>
+        <w:rPr>
+          <w:sz w:val="28"/>
+          <w:szCs w:val="28"/>
+        </w:rPr>
+        <w:t>4. Check availability of a book</w:t>
+      </w:r>
+    </w:p>
+    <w:p>
+      <w:pPr>
+        <w:rPr>
+          <w:sz w:val="28"/>
+          <w:szCs w:val="28"/>
+        </w:rPr>
+      </w:pPr>
+      <w:r>
+        <w:rPr>
+          <w:sz w:val="28"/>
+          <w:szCs w:val="28"/>
+        </w:rPr>
+        <w:t>5. Count occurrences of a book</w:t>
+      </w:r>
+    </w:p>
+    <w:p>
+      <w:pPr>
+        <w:rPr>
+          <w:sz w:val="28"/>
+          <w:szCs w:val="28"/>
+        </w:rPr>
+      </w:pPr>
+      <w:r>
+        <w:rPr>
+          <w:sz w:val="28"/>
+          <w:szCs w:val="28"/>
+        </w:rPr>
+        <w:t>6. Remove a book</w:t>
+      </w:r>
+    </w:p>
+    <w:p>
+      <w:pPr>
+        <w:rPr>
+          <w:sz w:val="28"/>
+          <w:szCs w:val="28"/>
+        </w:rPr>
+      </w:pPr>
+      <w:r>
+        <w:rPr>
+          <w:sz w:val="28"/>
+          <w:szCs w:val="28"/>
+        </w:rPr>
+        <w:t>7. Sort books alphabetically</w:t>
+      </w:r>
+    </w:p>
+    <w:p>
+      <w:pPr>
+        <w:rPr>
+          <w:sz w:val="28"/>
+          <w:szCs w:val="28"/>
+        </w:rPr>
+      </w:pPr>
+      <w:r>
+        <w:rPr>
+          <w:sz w:val="28"/>
+          <w:szCs w:val="28"/>
+        </w:rPr>
+        <w:t>8. Exit</w:t>
+      </w:r>
+    </w:p>
+    <w:p>
+      <w:pPr>
+        <w:rPr>
+          <w:sz w:val="28"/>
+          <w:szCs w:val="28"/>
+        </w:rPr>
+      </w:pPr>
+      <w:r>
+        <w:rPr>
+          <w:sz w:val="28"/>
+          <w:szCs w:val="28"/>
+        </w:rPr>
+        <w:t>Enter your choice:</w:t>
+      </w:r>
+    </w:p>
+    <w:p>
+      <w:pPr>
+        <w:rPr>
+          <w:sz w:val="28"/>
+          <w:szCs w:val="28"/>
+        </w:rPr>
+      </w:pPr>
+    </w:p>
+    <w:p>
+      <w:pPr>
+        <w:rPr>
+          <w:sz w:val="28"/>
+          <w:szCs w:val="28"/>
+        </w:rPr>
+      </w:pPr>
+      <w:r>
+        <w:rPr>
+          <w:sz w:val="28"/>
+          <w:szCs w:val="28"/>
+        </w:rPr>
+        <w:t>Requirements:</w:t>
+      </w:r>
+    </w:p>
+    <w:p>
+      <w:pPr>
+        <w:rPr>
+          <w:sz w:val="28"/>
+          <w:szCs w:val="28"/>
+        </w:rPr>
+      </w:pPr>
+    </w:p>
+    <w:p>
+      <w:pPr>
+        <w:rPr>
+          <w:sz w:val="28"/>
+          <w:szCs w:val="28"/>
+        </w:rPr>
+      </w:pPr>
+      <w:r>
+        <w:rPr>
+          <w:sz w:val="28"/>
+          <w:szCs w:val="28"/>
+        </w:rPr>
+        <w:t>Use a while True loop to keep showing the menu until the user selects Exit.</w:t>
+      </w:r>
+    </w:p>
+    <w:p>
+      <w:pPr>
+        <w:rPr>
+          <w:sz w:val="28"/>
+          <w:szCs w:val="28"/>
+        </w:rPr>
+      </w:pPr>
+      <w:r>
+        <w:rPr>
+          <w:sz w:val="28"/>
+          <w:szCs w:val="28"/>
+        </w:rPr>
+        <w:t>Use input() to take the user's choice and any required book title/position.</w:t>
+      </w:r>
+    </w:p>
+    <w:p>
+      <w:pPr>
+        <w:rPr>
+          <w:sz w:val="28"/>
+          <w:szCs w:val="28"/>
+        </w:rPr>
+      </w:pPr>
+      <w:r>
+        <w:rPr>
+          <w:sz w:val="28"/>
+          <w:szCs w:val="28"/>
+        </w:rPr>
+        <w:t>Use the appropriate list method for each operation (append(), insert(), index(), count(), remove(), sort()).</w:t>
+      </w:r>
+    </w:p>
+    <w:p>
+      <w:pPr>
+        <w:rPr>
+          <w:sz w:val="28"/>
+          <w:szCs w:val="28"/>
+        </w:rPr>
+      </w:pPr>
+      <w:r>
+        <w:rPr>
+          <w:sz w:val="28"/>
+          <w:szCs w:val="28"/>
+        </w:rPr>
+        <w:t>Handle invalid choices and cases where a book isn't found (e.g., using if title in books before calling index() or remove()).</w:t>
+      </w:r>
+    </w:p>
+    <w:p>
+      <w:pPr>
+        <w:rPr>
+          <w:sz w:val="28"/>
+          <w:szCs w:val="28"/>
+        </w:rPr>
+      </w:pPr>
+      <w:r>
+        <w:rPr>
+          <w:sz w:val="28"/>
+          <w:szCs w:val="28"/>
+        </w:rPr>
+        <w:t>Use enumerate() to display books with numbering wherever the list is shown to the user — specifically:</w:t>
+      </w:r>
+    </w:p>
+    <w:p>
+      <w:pPr>
+        <w:rPr>
+          <w:sz w:val="28"/>
+          <w:szCs w:val="28"/>
+        </w:rPr>
+      </w:pPr>
+      <w:r>
+        <w:rPr>
+          <w:sz w:val="28"/>
+          <w:szCs w:val="28"/>
+        </w:rPr>
+        <w:t>When displaying all books (option 1)</w:t>
+      </w:r>
+    </w:p>
+    <w:p>
+      <w:pPr>
+        <w:rPr>
+          <w:sz w:val="28"/>
+          <w:szCs w:val="28"/>
+        </w:rPr>
+      </w:pPr>
+      <w:r>
+        <w:rPr>
+          <w:sz w:val="28"/>
+          <w:szCs w:val="28"/>
+        </w:rPr>
+        <w:lastRenderedPageBreak/>
+        <w:t>When showing the current list before asking for an insert position (option 3), so the user can pick the correct index</w:t>
+      </w:r>
+    </w:p>
+    <w:p>
+      <w:pPr>
+        <w:rPr>
+          <w:sz w:val="28"/>
+          <w:szCs w:val="28"/>
+        </w:rPr>
+      </w:pPr>
+      <w:r>
+        <w:rPr>
+          <w:sz w:val="28"/>
+          <w:szCs w:val="28"/>
+        </w:rPr>
+        <w:t>When displaying the sorted list (option 7)</w:t>
+      </w:r>
+    </w:p>
+    <w:p>
+      <w:pPr>
+        <w:rPr>
+          <w:sz w:val="28"/>
+          <w:szCs w:val="28"/>
+        </w:rPr>
+      </w:pPr>
+      <w:r>
+        <w:rPr>
+          <w:sz w:val="28"/>
+          <w:szCs w:val="28"/>
+        </w:rPr>
+        <w:t>Q8. Write a Python program to demonstrate the use of list comprehension for the following tasks:</w:t>
+      </w:r>
+    </w:p>
+    <w:p>
+      <w:pPr>
+        <w:rPr>
+          <w:sz w:val="28"/>
+          <w:szCs w:val="28"/>
+        </w:rPr>
+      </w:pPr>
+    </w:p>
+    <w:p>
+      <w:pPr>
+        <w:rPr>
+          <w:sz w:val="28"/>
+          <w:szCs w:val="28"/>
+        </w:rPr>
+      </w:pPr>
+      <w:r>
+        <w:rPr>
+          <w:sz w:val="28"/>
+          <w:szCs w:val="28"/>
+        </w:rPr>
+        <w:t>a) Given a list of numbers, create a new list containing only the even numbers.</w:t>
+      </w:r>
+    </w:p>
+    <w:p>
+      <w:pPr>
+        <w:rPr>
+          <w:sz w:val="28"/>
+          <w:szCs w:val="28"/>
+        </w:rPr>
+      </w:pPr>
+    </w:p>
+    <w:p>
+      <w:pPr>
+        <w:rPr>
+          <w:sz w:val="28"/>
+          <w:szCs w:val="28"/>
+        </w:rPr>
+      </w:pPr>
+      <w:r>
+        <w:rPr>
+          <w:sz w:val="28"/>
+          <w:szCs w:val="28"/>
+        </w:rPr>
+        <w:t>b) Given a list of numbers, create a new list containing the square of each number.</w:t>
+      </w:r>
+    </w:p>
+    <w:p>
+      <w:pPr>
+        <w:rPr>
+          <w:sz w:val="28"/>
+          <w:szCs w:val="28"/>
+        </w:rPr>
+      </w:pPr>
+    </w:p>
+    <w:p>
+      <w:pPr>
+        <w:rPr>
+          <w:sz w:val="28"/>
+          <w:szCs w:val="28"/>
+        </w:rPr>
+      </w:pPr>
+      <w:r>
+        <w:rPr>
+          <w:sz w:val="28"/>
+          <w:szCs w:val="28"/>
+        </w:rPr>
+        <w:t>c) Given a list of strings (book titles), create a new list containing only the titles that have more than 10 characters.</w:t>
+      </w:r>
+    </w:p>
+    <w:p>
+      <w:pPr>
+        <w:rPr>
+          <w:sz w:val="28"/>
+          <w:szCs w:val="28"/>
+        </w:rPr>
+      </w:pPr>
+    </w:p>
+    <w:p>
+      <w:pPr>
+        <w:rPr>
+          <w:sz w:val="28"/>
+          <w:szCs w:val="28"/>
+        </w:rPr>
+      </w:pPr>
+      <w:r>
+        <w:rPr>
+          <w:sz w:val="28"/>
+          <w:szCs w:val="28"/>
+        </w:rPr>
+        <w:t>d) Given a list of numbers, create a new list containing the square of only the even numbers (combine filtering and transformation in one comprehension).</w:t>
+      </w:r>
+    </w:p>
+    <w:p>
+      <w:pPr>
+        <w:rPr>
+          <w:sz w:val="36"/>
+          <w:szCs w:val="36"/>
+        </w:rPr>
+      </w:pPr>
+      <w:r>
+        <w:rPr>
+          <w:sz w:val="36"/>
+          <w:szCs w:val="36"/>
+        </w:rPr>
+        <w:t>Programs, Sample Outputs and Results</w:t>
+      </w:r>
+      <w:r>
+        <w:rPr>
+          <w:sz w:val="36"/>
+          <w:szCs w:val="36"/>
+        </w:rPr>
+        <w:t>:</w:t>
+      </w:r>
+    </w:p>
+    <w:p>
+      <w:pPr>
         <w:tabs>
           <w:tab w:val="left" w:pos="3110"/>
         </w:tabs>
@@ -1184,7 +1402,14 @@
           <w:sz w:val="28"/>
           <w:szCs w:val="28"/>
         </w:rPr>
-        <w:t>Input and Output:</w:t>
+        <w:t xml:space="preserve"> Question 1: </w:t>
+      </w:r>
+      <w:r>
+        <w:rPr>
+          <w:sz w:val="28"/>
+          <w:szCs w:val="28"/>
+        </w:rPr>
+        <w:t>Patterns</w:t>
       </w:r>
     </w:p>
     <w:p>
@@ -1202,11 +1427,31 @@
           <w:sz w:val="28"/>
           <w:szCs w:val="28"/>
         </w:rPr>
+        <w:t>Program</w:t>
+      </w:r>
+    </w:p>
+    <w:p>
+      <w:pPr>
+        <w:tabs>
+          <w:tab w:val="left" w:pos="3110"/>
+        </w:tabs>
+        <w:rPr>
+          <w:sz w:val="28"/>
+          <w:szCs w:val="28"/>
+        </w:rPr>
+      </w:pPr>
+      <w:r>
+        <w:rPr>
+          <w:noProof/>
+          <w:sz w:val="28"/>
+          <w:szCs w:val="28"/>
+        </w:rPr>
+        <w:lastRenderedPageBreak/>
         <w:drawing>
-          <wp:inline distT="0" distB="0" distL="0" distR="0" wp14:anchorId="6D45BE69" wp14:editId="0204E63B">
-            <wp:extent cx="5731510" cy="1428115"/>
-            <wp:effectExtent l="0" t="0" r="2540" b="635"/>
-            <wp:docPr id="1525749388" name="Picture 1"/>
+          <wp:inline distT="0" distB="0" distL="0" distR="0" wp14:anchorId="001606F3" wp14:editId="45C8B8A4">
+            <wp:extent cx="5731510" cy="5198745"/>
+            <wp:effectExtent l="0" t="0" r="2540" b="1905"/>
+            <wp:docPr id="1209534615" name="Picture 1"/>
             <wp:cNvGraphicFramePr>
               <a:graphicFrameLocks xmlns:a="http://schemas.openxmlformats.org/drawingml/2006/main" noChangeAspect="1"/>
             </wp:cNvGraphicFramePr>
@@ -1214,7 +1459,7 @@
               <a:graphicData uri="http://schemas.openxmlformats.org/drawingml/2006/picture">
                 <pic:pic xmlns:pic="http://schemas.openxmlformats.org/drawingml/2006/picture">
                   <pic:nvPicPr>
-                    <pic:cNvPr id="1525749388" name=""/>
+                    <pic:cNvPr id="1209534615" name=""/>
                     <pic:cNvPicPr/>
                   </pic:nvPicPr>
                   <pic:blipFill>
@@ -1226,7 +1471,7 @@
                   <pic:spPr>
                     <a:xfrm>
                       <a:off x="0" y="0"/>
-                      <a:ext cx="5731510" cy="1428115"/>
+                      <a:ext cx="5731510" cy="5198745"/>
                     </a:xfrm>
                     <a:prstGeom prst="rect">
                       <a:avLst/>
@@ -1244,118 +1489,32 @@
         <w:tabs>
           <w:tab w:val="left" w:pos="3110"/>
         </w:tabs>
-      </w:pPr>
-      <w:r>
-        <w:t xml:space="preserve">Result: The program </w:t>
-      </w:r>
-      <w:r>
-        <w:t xml:space="preserve">executed successfully by taking </w:t>
-      </w:r>
-      <w:r>
-        <w:t xml:space="preserve">input from user to book bus tickets </w:t>
-      </w:r>
-      <w:r>
-        <w:t>and displayed number of tickets available after booking</w:t>
-      </w:r>
-      <w:r>
-        <w:t>.</w:t>
-      </w:r>
-    </w:p>
-    <w:p>
-      <w:pPr>
-        <w:tabs>
-          <w:tab w:val="left" w:pos="3110"/>
-        </w:tabs>
-        <w:rPr>
-          <w:sz w:val="28"/>
-          <w:szCs w:val="28"/>
-        </w:rPr>
-      </w:pPr>
-      <w:r>
-        <w:rPr>
-          <w:sz w:val="32"/>
-          <w:szCs w:val="32"/>
-        </w:rPr>
-        <w:t>Question-2:</w:t>
-      </w:r>
-      <w:r>
-        <w:rPr>
-          <w:sz w:val="32"/>
-          <w:szCs w:val="32"/>
-        </w:rPr>
-        <w:t xml:space="preserve"> </w:t>
-      </w:r>
-      <w:r>
-        <w:rPr>
-          <w:sz w:val="28"/>
-          <w:szCs w:val="28"/>
-        </w:rPr>
-        <w:t xml:space="preserve">Write a program using a while loop that allows a user a maximum of 3 attempts to enter the correct 4-digit ATM PIN. Display "Access Granted" on success. If all 3 attempts fail, display "Account Locked" and </w:t>
-      </w:r>
-      <w:proofErr w:type="spellStart"/>
-      <w:proofErr w:type="gramStart"/>
-      <w:r>
-        <w:rPr>
-          <w:sz w:val="28"/>
-          <w:szCs w:val="28"/>
-        </w:rPr>
-        <w:t>terminate.</w:t>
-      </w:r>
-      <w:r>
-        <w:rPr>
-          <w:sz w:val="28"/>
-          <w:szCs w:val="28"/>
-        </w:rPr>
-        <w:t>Program</w:t>
-      </w:r>
-      <w:proofErr w:type="spellEnd"/>
-      <w:proofErr w:type="gramEnd"/>
-      <w:r>
-        <w:rPr>
-          <w:sz w:val="28"/>
-          <w:szCs w:val="28"/>
-        </w:rPr>
-        <w:t>:</w:t>
-      </w:r>
-    </w:p>
-    <w:p>
-      <w:pPr>
-        <w:tabs>
-          <w:tab w:val="left" w:pos="3110"/>
-        </w:tabs>
-        <w:rPr>
-          <w:sz w:val="28"/>
-          <w:szCs w:val="28"/>
-        </w:rPr>
-      </w:pPr>
-      <w:r>
-        <w:rPr>
-          <w:sz w:val="28"/>
-          <w:szCs w:val="28"/>
-        </w:rPr>
-        <w:t>Python Code:</w:t>
-      </w:r>
-    </w:p>
-    <w:p>
-      <w:pPr>
-        <w:tabs>
-          <w:tab w:val="left" w:pos="3110"/>
-        </w:tabs>
-        <w:rPr>
-          <w:sz w:val="28"/>
-          <w:szCs w:val="28"/>
-        </w:rPr>
-      </w:pPr>
-      <w:r>
-        <w:rPr>
-          <w:sz w:val="28"/>
-          <w:szCs w:val="28"/>
+        <w:rPr>
+          <w:sz w:val="28"/>
+          <w:szCs w:val="28"/>
+        </w:rPr>
+      </w:pPr>
+      <w:r>
+        <w:rPr>
+          <w:sz w:val="28"/>
+          <w:szCs w:val="28"/>
+        </w:rPr>
+        <w:t>Input and Output:</w:t>
+      </w:r>
+    </w:p>
+    <w:p>
+      <w:pPr>
+        <w:pStyle w:val="NormalWeb"/>
+      </w:pPr>
+      <w:r>
+        <w:rPr>
+          <w:noProof/>
         </w:rPr>
         <w:drawing>
-          <wp:inline distT="0" distB="0" distL="0" distR="0" wp14:anchorId="48C355BB" wp14:editId="6A74015A">
-            <wp:extent cx="5731510" cy="1970405"/>
-            <wp:effectExtent l="0" t="0" r="2540" b="0"/>
-            <wp:docPr id="1382345077" name="Picture 1"/>
+          <wp:inline distT="0" distB="0" distL="0" distR="0" wp14:anchorId="41760B39" wp14:editId="1C51B4D2">
+            <wp:extent cx="5651500" cy="2881745"/>
+            <wp:effectExtent l="0" t="0" r="6350" b="0"/>
+            <wp:docPr id="2" name="Picture 1"/>
             <wp:cNvGraphicFramePr>
               <a:graphicFrameLocks xmlns:a="http://schemas.openxmlformats.org/drawingml/2006/main" noChangeAspect="1"/>
             </wp:cNvGraphicFramePr>
@@ -1363,203 +1522,13 @@
               <a:graphicData uri="http://schemas.openxmlformats.org/drawingml/2006/picture">
                 <pic:pic xmlns:pic="http://schemas.openxmlformats.org/drawingml/2006/picture">
                   <pic:nvPicPr>
-                    <pic:cNvPr id="1382345077" name=""/>
-                    <pic:cNvPicPr/>
-                  </pic:nvPicPr>
-                  <pic:blipFill>
-                    <a:blip r:embed="rId9"/>
-                    <a:stretch>
-                      <a:fillRect/>
-                    </a:stretch>
-                  </pic:blipFill>
-                  <pic:spPr>
-                    <a:xfrm>
-                      <a:off x="0" y="0"/>
-                      <a:ext cx="5731510" cy="1970405"/>
-                    </a:xfrm>
-                    <a:prstGeom prst="rect">
-                      <a:avLst/>
-                    </a:prstGeom>
-                  </pic:spPr>
-                </pic:pic>
-              </a:graphicData>
-            </a:graphic>
-          </wp:inline>
-        </w:drawing>
-      </w:r>
-    </w:p>
-    <w:p>
-      <w:pPr>
-        <w:tabs>
-          <w:tab w:val="left" w:pos="3110"/>
-        </w:tabs>
-      </w:pPr>
-      <w:proofErr w:type="spellStart"/>
-      <w:r>
-        <w:t>Input&amp;Output</w:t>
-      </w:r>
-      <w:proofErr w:type="spellEnd"/>
-      <w:r>
-        <w:t>:</w:t>
-      </w:r>
-    </w:p>
-    <w:p>
-      <w:pPr>
-        <w:tabs>
-          <w:tab w:val="left" w:pos="3110"/>
-        </w:tabs>
-      </w:pPr>
-      <w:r>
-        <w:lastRenderedPageBreak/>
-        <w:drawing>
-          <wp:inline distT="0" distB="0" distL="0" distR="0" wp14:anchorId="0355D1A7" wp14:editId="0E589E75">
-            <wp:extent cx="5425910" cy="1303133"/>
-            <wp:effectExtent l="0" t="0" r="3810" b="0"/>
-            <wp:docPr id="1635554375" name="Picture 1"/>
-            <wp:cNvGraphicFramePr>
-              <a:graphicFrameLocks xmlns:a="http://schemas.openxmlformats.org/drawingml/2006/main" noChangeAspect="1"/>
-            </wp:cNvGraphicFramePr>
-            <a:graphic xmlns:a="http://schemas.openxmlformats.org/drawingml/2006/main">
-              <a:graphicData uri="http://schemas.openxmlformats.org/drawingml/2006/picture">
-                <pic:pic xmlns:pic="http://schemas.openxmlformats.org/drawingml/2006/picture">
-                  <pic:nvPicPr>
-                    <pic:cNvPr id="1635554375" name=""/>
-                    <pic:cNvPicPr/>
-                  </pic:nvPicPr>
-                  <pic:blipFill>
-                    <a:blip r:embed="rId10"/>
-                    <a:stretch>
-                      <a:fillRect/>
-                    </a:stretch>
-                  </pic:blipFill>
-                  <pic:spPr>
-                    <a:xfrm>
-                      <a:off x="0" y="0"/>
-                      <a:ext cx="5425910" cy="1303133"/>
-                    </a:xfrm>
-                    <a:prstGeom prst="rect">
-                      <a:avLst/>
-                    </a:prstGeom>
-                  </pic:spPr>
-                </pic:pic>
-              </a:graphicData>
-            </a:graphic>
-          </wp:inline>
-        </w:drawing>
-      </w:r>
-    </w:p>
-    <w:p>
-      <w:pPr>
-        <w:tabs>
-          <w:tab w:val="left" w:pos="3110"/>
-        </w:tabs>
-      </w:pPr>
-      <w:proofErr w:type="spellStart"/>
-      <w:proofErr w:type="gramStart"/>
-      <w:r>
-        <w:t>Result:The</w:t>
-      </w:r>
-      <w:proofErr w:type="spellEnd"/>
-      <w:proofErr w:type="gramEnd"/>
-      <w:r>
-        <w:t xml:space="preserve"> program is executed </w:t>
-      </w:r>
-      <w:proofErr w:type="gramStart"/>
-      <w:r>
-        <w:t>successfully ,by</w:t>
-      </w:r>
-      <w:proofErr w:type="gramEnd"/>
-      <w:r>
-        <w:t xml:space="preserve"> taking input </w:t>
-      </w:r>
-      <w:r>
-        <w:t>from user and applied all conditions</w:t>
-      </w:r>
-      <w:r>
-        <w:t xml:space="preserve"> by given 3 chances for correct input identification</w:t>
-      </w:r>
-    </w:p>
-    <w:p>
-      <w:pPr>
-        <w:rPr>
-          <w:sz w:val="28"/>
-          <w:szCs w:val="28"/>
-        </w:rPr>
-      </w:pPr>
-      <w:r>
-        <w:rPr>
-          <w:sz w:val="28"/>
-          <w:szCs w:val="28"/>
-        </w:rPr>
-        <w:t>Question-3:</w:t>
-      </w:r>
-      <w:r>
-        <w:rPr>
-          <w:sz w:val="28"/>
-          <w:szCs w:val="28"/>
-        </w:rPr>
-        <w:t xml:space="preserve"> </w:t>
-      </w:r>
-      <w:r>
-        <w:rPr>
-          <w:sz w:val="28"/>
-          <w:szCs w:val="28"/>
-        </w:rPr>
-        <w:t>Write a program using a while loop that generates a random number between 1 and 50 and allows the user to keep guessing until they guess correctly. After each guess, display whether the guess was too high or too low. Display the total number of attempts taken once the correct number is guessed.</w:t>
-      </w:r>
-    </w:p>
-    <w:p>
-      <w:pPr>
-        <w:tabs>
-          <w:tab w:val="left" w:pos="3110"/>
-        </w:tabs>
-        <w:rPr>
-          <w:sz w:val="28"/>
-          <w:szCs w:val="28"/>
-        </w:rPr>
-      </w:pPr>
-      <w:r>
-        <w:rPr>
-          <w:sz w:val="28"/>
-          <w:szCs w:val="28"/>
-        </w:rPr>
-        <w:t>Program:</w:t>
-      </w:r>
-    </w:p>
-    <w:p>
-      <w:pPr>
-        <w:tabs>
-          <w:tab w:val="left" w:pos="3110"/>
-        </w:tabs>
-        <w:rPr>
-          <w:sz w:val="28"/>
-          <w:szCs w:val="28"/>
-        </w:rPr>
-      </w:pPr>
-      <w:r>
-        <w:rPr>
-          <w:sz w:val="28"/>
-          <w:szCs w:val="28"/>
-        </w:rPr>
-        <w:drawing>
-          <wp:inline distT="0" distB="0" distL="0" distR="0" wp14:anchorId="7D4FB3B1" wp14:editId="1F2EA949">
-            <wp:extent cx="5731510" cy="3371215"/>
-            <wp:effectExtent l="0" t="0" r="2540" b="635"/>
-            <wp:docPr id="1046922806" name="Picture 2"/>
-            <wp:cNvGraphicFramePr>
-              <a:graphicFrameLocks xmlns:a="http://schemas.openxmlformats.org/drawingml/2006/main" noChangeAspect="1"/>
-            </wp:cNvGraphicFramePr>
-            <a:graphic xmlns:a="http://schemas.openxmlformats.org/drawingml/2006/main">
-              <a:graphicData uri="http://schemas.openxmlformats.org/drawingml/2006/picture">
-                <pic:pic xmlns:pic="http://schemas.openxmlformats.org/drawingml/2006/picture">
-                  <pic:nvPicPr>
-                    <pic:cNvPr id="0" name="Picture 6"/>
+                    <pic:cNvPr id="0" name="Picture 2"/>
                     <pic:cNvPicPr>
                       <a:picLocks noChangeAspect="1" noChangeArrowheads="1"/>
                     </pic:cNvPicPr>
                   </pic:nvPicPr>
                   <pic:blipFill>
-                    <a:blip r:embed="rId11">
+                    <a:blip r:embed="rId9">
                       <a:extLst>
                         <a:ext uri="{28A0092B-C50C-407E-A947-70E740481C1C}">
                           <a14:useLocalDpi xmlns:a14="http://schemas.microsoft.com/office/drawing/2010/main" val="0"/>
@@ -1574,7 +1543,7 @@
                   <pic:spPr bwMode="auto">
                     <a:xfrm>
                       <a:off x="0" y="0"/>
-                      <a:ext cx="5731510" cy="3371215"/>
+                      <a:ext cx="5709660" cy="2911401"/>
                     </a:xfrm>
                     <a:prstGeom prst="rect">
                       <a:avLst/>
@@ -1590,13 +1559,6 @@
           </wp:inline>
         </w:drawing>
       </w:r>
-      <w:r>
-        <w:rPr>
-          <w:sz w:val="28"/>
-          <w:szCs w:val="28"/>
-        </w:rPr>
-        <w:t>Input &amp; Output:</w:t>
-      </w:r>
     </w:p>
     <w:p>
       <w:pPr>
@@ -1608,16 +1570,102 @@
           <w:szCs w:val="28"/>
         </w:rPr>
       </w:pPr>
-      <w:r>
-        <w:rPr>
+    </w:p>
+    <w:p>
+      <w:pPr>
+        <w:tabs>
+          <w:tab w:val="left" w:pos="3110"/>
+        </w:tabs>
+      </w:pPr>
+      <w:r>
+        <w:t xml:space="preserve">Result: The program </w:t>
+      </w:r>
+      <w:r>
+        <w:t xml:space="preserve">executed successfully by </w:t>
+      </w:r>
+      <w:r>
+        <w:t>displaying the patterns</w:t>
+      </w:r>
+    </w:p>
+    <w:p>
+      <w:pPr>
+        <w:rPr>
+          <w:sz w:val="28"/>
+          <w:szCs w:val="28"/>
+        </w:rPr>
+      </w:pPr>
+      <w:r>
+        <w:rPr>
+          <w:sz w:val="32"/>
+          <w:szCs w:val="32"/>
+        </w:rPr>
+        <w:t>Question-2:</w:t>
+      </w:r>
+      <w:r>
+        <w:rPr>
+          <w:sz w:val="32"/>
+          <w:szCs w:val="32"/>
+        </w:rPr>
+        <w:t xml:space="preserve"> </w:t>
+      </w:r>
+      <w:r>
+        <w:rPr>
+          <w:sz w:val="28"/>
+          <w:szCs w:val="28"/>
+        </w:rPr>
+        <w:t xml:space="preserve">. Write a Python program to shift each character of a given string by one position in the ASCII sequence. </w:t>
+      </w:r>
+    </w:p>
+    <w:p>
+      <w:pPr>
+        <w:tabs>
+          <w:tab w:val="left" w:pos="3110"/>
+        </w:tabs>
+        <w:rPr>
+          <w:sz w:val="28"/>
+          <w:szCs w:val="28"/>
+        </w:rPr>
+      </w:pPr>
+    </w:p>
+    <w:p>
+      <w:pPr>
+        <w:tabs>
+          <w:tab w:val="left" w:pos="3110"/>
+        </w:tabs>
+        <w:rPr>
+          <w:sz w:val="28"/>
+          <w:szCs w:val="28"/>
+        </w:rPr>
+      </w:pPr>
+      <w:r>
+        <w:rPr>
+          <w:sz w:val="28"/>
+          <w:szCs w:val="28"/>
+        </w:rPr>
+        <w:t>Python Code:</w:t>
+      </w:r>
+    </w:p>
+    <w:p>
+      <w:pPr>
+        <w:tabs>
+          <w:tab w:val="left" w:pos="3110"/>
+        </w:tabs>
+        <w:rPr>
+          <w:sz w:val="28"/>
+          <w:szCs w:val="28"/>
+        </w:rPr>
+      </w:pPr>
+      <w:r>
+        <w:rPr>
+          <w:noProof/>
           <w:sz w:val="28"/>
           <w:szCs w:val="28"/>
         </w:rPr>
         <w:drawing>
-          <wp:inline distT="0" distB="0" distL="0" distR="0" wp14:anchorId="40A64509" wp14:editId="3A81FCB4">
-            <wp:extent cx="5731510" cy="1576705"/>
-            <wp:effectExtent l="0" t="0" r="2540" b="4445"/>
-            <wp:docPr id="1410945791" name="Picture 1"/>
+          <wp:inline distT="0" distB="0" distL="0" distR="0" wp14:anchorId="56468B48" wp14:editId="6B5A25C4">
+            <wp:extent cx="2842506" cy="853514"/>
+            <wp:effectExtent l="0" t="0" r="0" b="3810"/>
+            <wp:docPr id="1938291375" name="Picture 1"/>
             <wp:cNvGraphicFramePr>
               <a:graphicFrameLocks xmlns:a="http://schemas.openxmlformats.org/drawingml/2006/main" noChangeAspect="1"/>
             </wp:cNvGraphicFramePr>
@@ -1625,7 +1673,192 @@
               <a:graphicData uri="http://schemas.openxmlformats.org/drawingml/2006/picture">
                 <pic:pic xmlns:pic="http://schemas.openxmlformats.org/drawingml/2006/picture">
                   <pic:nvPicPr>
-                    <pic:cNvPr id="1410945791" name=""/>
+                    <pic:cNvPr id="1938291375" name=""/>
+                    <pic:cNvPicPr/>
+                  </pic:nvPicPr>
+                  <pic:blipFill>
+                    <a:blip r:embed="rId10"/>
+                    <a:stretch>
+                      <a:fillRect/>
+                    </a:stretch>
+                  </pic:blipFill>
+                  <pic:spPr>
+                    <a:xfrm>
+                      <a:off x="0" y="0"/>
+                      <a:ext cx="2842506" cy="853514"/>
+                    </a:xfrm>
+                    <a:prstGeom prst="rect">
+                      <a:avLst/>
+                    </a:prstGeom>
+                  </pic:spPr>
+                </pic:pic>
+              </a:graphicData>
+            </a:graphic>
+          </wp:inline>
+        </w:drawing>
+      </w:r>
+    </w:p>
+    <w:p>
+      <w:pPr>
+        <w:tabs>
+          <w:tab w:val="left" w:pos="3110"/>
+        </w:tabs>
+      </w:pPr>
+      <w:r>
+        <w:t>Input&amp;Output:</w:t>
+      </w:r>
+    </w:p>
+    <w:p>
+      <w:pPr>
+        <w:tabs>
+          <w:tab w:val="left" w:pos="3110"/>
+        </w:tabs>
+      </w:pPr>
+      <w:r>
+        <w:rPr>
+          <w:noProof/>
+        </w:rPr>
+        <w:drawing>
+          <wp:inline distT="0" distB="0" distL="0" distR="0" wp14:anchorId="5258416A" wp14:editId="1ED251EE">
+            <wp:extent cx="3467400" cy="556308"/>
+            <wp:effectExtent l="0" t="0" r="0" b="0"/>
+            <wp:docPr id="1802097214" name="Picture 1"/>
+            <wp:cNvGraphicFramePr>
+              <a:graphicFrameLocks xmlns:a="http://schemas.openxmlformats.org/drawingml/2006/main" noChangeAspect="1"/>
+            </wp:cNvGraphicFramePr>
+            <a:graphic xmlns:a="http://schemas.openxmlformats.org/drawingml/2006/main">
+              <a:graphicData uri="http://schemas.openxmlformats.org/drawingml/2006/picture">
+                <pic:pic xmlns:pic="http://schemas.openxmlformats.org/drawingml/2006/picture">
+                  <pic:nvPicPr>
+                    <pic:cNvPr id="1802097214" name=""/>
+                    <pic:cNvPicPr/>
+                  </pic:nvPicPr>
+                  <pic:blipFill>
+                    <a:blip r:embed="rId11"/>
+                    <a:stretch>
+                      <a:fillRect/>
+                    </a:stretch>
+                  </pic:blipFill>
+                  <pic:spPr>
+                    <a:xfrm>
+                      <a:off x="0" y="0"/>
+                      <a:ext cx="3467400" cy="556308"/>
+                    </a:xfrm>
+                    <a:prstGeom prst="rect">
+                      <a:avLst/>
+                    </a:prstGeom>
+                  </pic:spPr>
+                </pic:pic>
+              </a:graphicData>
+            </a:graphic>
+          </wp:inline>
+        </w:drawing>
+      </w:r>
+    </w:p>
+    <w:p>
+      <w:pPr>
+        <w:rPr>
+          <w:sz w:val="28"/>
+          <w:szCs w:val="28"/>
+        </w:rPr>
+      </w:pPr>
+      <w:r>
+        <w:t xml:space="preserve">Result:The program is executed successfully ,by taking input </w:t>
+      </w:r>
+      <w:r>
+        <w:t xml:space="preserve">from </w:t>
+      </w:r>
+      <w:r>
+        <w:t xml:space="preserve"> and </w:t>
+      </w:r>
+      <w:r>
+        <w:t>shift each character of a given string by one position in the ASCII sequence</w:t>
+      </w:r>
+      <w:r>
+        <w:rPr>
+          <w:sz w:val="28"/>
+          <w:szCs w:val="28"/>
+        </w:rPr>
+        <w:t xml:space="preserve">. </w:t>
+      </w:r>
+    </w:p>
+    <w:p>
+      <w:pPr>
+        <w:rPr>
+          <w:sz w:val="28"/>
+          <w:szCs w:val="28"/>
+        </w:rPr>
+      </w:pPr>
+      <w:r>
+        <w:rPr>
+          <w:sz w:val="28"/>
+          <w:szCs w:val="28"/>
+        </w:rPr>
+        <w:t>Question-3:</w:t>
+      </w:r>
+      <w:r>
+        <w:rPr>
+          <w:sz w:val="28"/>
+          <w:szCs w:val="28"/>
+        </w:rPr>
+        <w:t xml:space="preserve"> </w:t>
+      </w:r>
+      <w:r>
+        <w:rPr>
+          <w:sz w:val="28"/>
+          <w:szCs w:val="28"/>
+        </w:rPr>
+        <w:t>Write a Python program to read a specified number of elements from the user through the keyboard and store them in a list. The program should: 1. Prompt the user to enter the number of elements, n. 2. Use a loop to accept n elements one by one from the user. 3. Append each entered element to a list. 4. Display the final list after all elements have been entered.</w:t>
+      </w:r>
+    </w:p>
+    <w:p>
+      <w:pPr>
+        <w:tabs>
+          <w:tab w:val="left" w:pos="3110"/>
+        </w:tabs>
+        <w:rPr>
+          <w:sz w:val="28"/>
+          <w:szCs w:val="28"/>
+        </w:rPr>
+      </w:pPr>
+      <w:r>
+        <w:rPr>
+          <w:sz w:val="28"/>
+          <w:szCs w:val="28"/>
+        </w:rPr>
+        <w:t>Program:</w:t>
+      </w:r>
+    </w:p>
+    <w:p>
+      <w:pPr>
+        <w:tabs>
+          <w:tab w:val="left" w:pos="3110"/>
+        </w:tabs>
+        <w:rPr>
+          <w:noProof/>
+          <w:sz w:val="28"/>
+          <w:szCs w:val="28"/>
+        </w:rPr>
+      </w:pPr>
+      <w:r>
+        <w:rPr>
+          <w:noProof/>
+          <w:sz w:val="28"/>
+          <w:szCs w:val="28"/>
+        </w:rPr>
+        <w:drawing>
+          <wp:inline distT="0" distB="0" distL="0" distR="0" wp14:anchorId="2F856EDE" wp14:editId="2CFB1A09">
+            <wp:extent cx="4351397" cy="1013548"/>
+            <wp:effectExtent l="0" t="0" r="0" b="0"/>
+            <wp:docPr id="1773949324" name="Picture 1"/>
+            <wp:cNvGraphicFramePr>
+              <a:graphicFrameLocks xmlns:a="http://schemas.openxmlformats.org/drawingml/2006/main" noChangeAspect="1"/>
+            </wp:cNvGraphicFramePr>
+            <a:graphic xmlns:a="http://schemas.openxmlformats.org/drawingml/2006/main">
+              <a:graphicData uri="http://schemas.openxmlformats.org/drawingml/2006/picture">
+                <pic:pic xmlns:pic="http://schemas.openxmlformats.org/drawingml/2006/picture">
+                  <pic:nvPicPr>
+                    <pic:cNvPr id="1773949324" name=""/>
                     <pic:cNvPicPr/>
                   </pic:nvPicPr>
                   <pic:blipFill>
@@ -1637,7 +1870,7 @@
                   <pic:spPr>
                     <a:xfrm>
                       <a:off x="0" y="0"/>
-                      <a:ext cx="5731510" cy="1576705"/>
+                      <a:ext cx="4351397" cy="1013548"/>
                     </a:xfrm>
                     <a:prstGeom prst="rect">
                       <a:avLst/>
@@ -1652,57 +1885,27 @@
     </w:p>
     <w:p>
       <w:pPr>
-        <w:rPr>
-          <w:b/>
-          <w:bCs/>
-          <w:sz w:val="28"/>
-          <w:szCs w:val="28"/>
-        </w:rPr>
-      </w:pPr>
-      <w:r>
-        <w:rPr>
-          <w:sz w:val="28"/>
-          <w:szCs w:val="28"/>
-        </w:rPr>
-        <w:lastRenderedPageBreak/>
-        <w:t>Question-4:</w:t>
-      </w:r>
-      <w:r>
-        <w:rPr>
-          <w:b/>
-          <w:bCs/>
-          <w:sz w:val="28"/>
-          <w:szCs w:val="28"/>
-        </w:rPr>
-        <w:t xml:space="preserve"> </w:t>
-      </w:r>
-      <w:r>
-        <w:rPr>
-          <w:b/>
-          <w:bCs/>
-          <w:sz w:val="28"/>
-          <w:szCs w:val="28"/>
-        </w:rPr>
-        <w:t>Write a program using a while loop to manage a shop's inventory starting with 50 units in stock. The program should repeatedly accept the number of units sold, update the stock, and display a "Reorder Alert" when stock falls to 10 or below. The loop should terminate when the user enters -1 or stock reaches 0.</w:t>
-      </w:r>
-    </w:p>
-    <w:p>
-      <w:pPr>
-        <w:rPr>
-          <w:sz w:val="28"/>
-          <w:szCs w:val="28"/>
-        </w:rPr>
-      </w:pPr>
-      <w:r>
-        <w:rPr>
-          <w:sz w:val="28"/>
-          <w:szCs w:val="28"/>
-        </w:rPr>
-        <w:t>Program:</w:t>
-      </w:r>
-    </w:p>
-    <w:p>
-      <w:pPr>
+        <w:tabs>
+          <w:tab w:val="left" w:pos="3110"/>
+        </w:tabs>
+        <w:rPr>
+          <w:sz w:val="28"/>
+          <w:szCs w:val="28"/>
+        </w:rPr>
+      </w:pPr>
+      <w:r>
+        <w:rPr>
+          <w:sz w:val="28"/>
+          <w:szCs w:val="28"/>
+        </w:rPr>
+        <w:t>Input &amp; Output:</w:t>
+      </w:r>
+    </w:p>
+    <w:p>
+      <w:pPr>
+        <w:tabs>
+          <w:tab w:val="left" w:pos="3110"/>
+        </w:tabs>
         <w:rPr>
           <w:sz w:val="28"/>
           <w:szCs w:val="28"/>
@@ -1714,10 +1917,10 @@
           <w:szCs w:val="28"/>
         </w:rPr>
         <w:drawing>
-          <wp:inline distT="0" distB="0" distL="0" distR="0" wp14:anchorId="0917E757" wp14:editId="028EFA4F">
-            <wp:extent cx="5731510" cy="3352800"/>
-            <wp:effectExtent l="0" t="0" r="2540" b="0"/>
-            <wp:docPr id="813260759" name="Picture 1"/>
+          <wp:inline distT="0" distB="0" distL="0" distR="0" wp14:anchorId="59D332D6" wp14:editId="2D7D2B54">
+            <wp:extent cx="3685309" cy="1087935"/>
+            <wp:effectExtent l="0" t="0" r="0" b="0"/>
+            <wp:docPr id="766749270" name="Picture 1"/>
             <wp:cNvGraphicFramePr>
               <a:graphicFrameLocks xmlns:a="http://schemas.openxmlformats.org/drawingml/2006/main" noChangeAspect="1"/>
             </wp:cNvGraphicFramePr>
@@ -1725,7 +1928,7 @@
               <a:graphicData uri="http://schemas.openxmlformats.org/drawingml/2006/picture">
                 <pic:pic xmlns:pic="http://schemas.openxmlformats.org/drawingml/2006/picture">
                   <pic:nvPicPr>
-                    <pic:cNvPr id="813260759" name=""/>
+                    <pic:cNvPr id="766749270" name=""/>
                     <pic:cNvPicPr/>
                   </pic:nvPicPr>
                   <pic:blipFill>
@@ -1737,7 +1940,7 @@
                   <pic:spPr>
                     <a:xfrm>
                       <a:off x="0" y="0"/>
-                      <a:ext cx="5731510" cy="3352800"/>
+                      <a:ext cx="3700521" cy="1092426"/>
                     </a:xfrm>
                     <a:prstGeom prst="rect">
                       <a:avLst/>
@@ -1757,15 +1960,97 @@
           <w:szCs w:val="28"/>
         </w:rPr>
       </w:pPr>
-      <w:proofErr w:type="spellStart"/>
-      <w:r>
-        <w:rPr>
-          <w:sz w:val="28"/>
-          <w:szCs w:val="28"/>
-        </w:rPr>
-        <w:t>Input&amp;Output</w:t>
-      </w:r>
-      <w:proofErr w:type="spellEnd"/>
+      <w:r>
+        <w:lastRenderedPageBreak/>
+        <w:t xml:space="preserve">Result:The program is executed successfully ,by taking </w:t>
+      </w:r>
+      <w:r>
+        <w:t>no of elements from user and elements to append each.</w:t>
+      </w:r>
+    </w:p>
+    <w:p>
+      <w:pPr>
+        <w:tabs>
+          <w:tab w:val="left" w:pos="3110"/>
+        </w:tabs>
+        <w:rPr>
+          <w:sz w:val="28"/>
+          <w:szCs w:val="28"/>
+        </w:rPr>
+      </w:pPr>
+    </w:p>
+    <w:p>
+      <w:pPr>
+        <w:tabs>
+          <w:tab w:val="left" w:pos="3110"/>
+        </w:tabs>
+        <w:rPr>
+          <w:sz w:val="28"/>
+          <w:szCs w:val="28"/>
+        </w:rPr>
+      </w:pPr>
+    </w:p>
+    <w:p>
+      <w:pPr>
+        <w:rPr>
+          <w:sz w:val="28"/>
+          <w:szCs w:val="28"/>
+        </w:rPr>
+      </w:pPr>
+      <w:r>
+        <w:rPr>
+          <w:sz w:val="28"/>
+          <w:szCs w:val="28"/>
+        </w:rPr>
+        <w:t>Question-4</w:t>
+      </w:r>
+      <w:r>
+        <w:t xml:space="preserve"> </w:t>
+      </w:r>
+      <w:r>
+        <w:rPr>
+          <w:sz w:val="28"/>
+          <w:szCs w:val="28"/>
+        </w:rPr>
+        <w:t>Write a Python program to read temperature values for each day of the week (Monday to Sunday) from the user and store them in a list. Find the maximum and minimum temperature recorded during the week, along with the day on which it occurred</w:t>
+      </w:r>
+    </w:p>
+    <w:p>
+      <w:pPr>
+        <w:rPr>
+          <w:sz w:val="28"/>
+          <w:szCs w:val="28"/>
+        </w:rPr>
+      </w:pPr>
+      <w:r>
+        <w:rPr>
+          <w:sz w:val="28"/>
+          <w:szCs w:val="28"/>
+        </w:rPr>
+        <w:t>Program</w:t>
+      </w:r>
+      <w:r>
+        <w:rPr>
+          <w:sz w:val="28"/>
+          <w:szCs w:val="28"/>
+        </w:rPr>
+        <w:t xml:space="preserve"> ,</w:t>
+      </w:r>
+      <w:r>
+        <w:rPr>
+          <w:sz w:val="28"/>
+          <w:szCs w:val="28"/>
+        </w:rPr>
+        <w:t>Input&amp;Output:</w:t>
+      </w:r>
+    </w:p>
+    <w:p>
+      <w:pPr>
+        <w:rPr>
+          <w:sz w:val="28"/>
+          <w:szCs w:val="28"/>
+        </w:rPr>
+      </w:pPr>
       <w:r>
         <w:rPr>
           <w:sz w:val="28"/>
@@ -1787,10 +2072,10 @@
           <w:szCs w:val="28"/>
         </w:rPr>
         <w:drawing>
-          <wp:inline distT="0" distB="0" distL="0" distR="0" wp14:anchorId="2B5D85C3" wp14:editId="0AD3786E">
-            <wp:extent cx="5731510" cy="772795"/>
-            <wp:effectExtent l="0" t="0" r="2540" b="8255"/>
-            <wp:docPr id="959434299" name="Picture 1"/>
+          <wp:inline distT="0" distB="0" distL="0" distR="0" wp14:anchorId="7346A9F1" wp14:editId="40D1E980">
+            <wp:extent cx="5731510" cy="4093845"/>
+            <wp:effectExtent l="0" t="0" r="2540" b="1905"/>
+            <wp:docPr id="1340443365" name="Picture 1"/>
             <wp:cNvGraphicFramePr>
               <a:graphicFrameLocks xmlns:a="http://schemas.openxmlformats.org/drawingml/2006/main" noChangeAspect="1"/>
             </wp:cNvGraphicFramePr>
@@ -1798,7 +2083,7 @@
               <a:graphicData uri="http://schemas.openxmlformats.org/drawingml/2006/picture">
                 <pic:pic xmlns:pic="http://schemas.openxmlformats.org/drawingml/2006/picture">
                   <pic:nvPicPr>
-                    <pic:cNvPr id="959434299" name=""/>
+                    <pic:cNvPr id="1340443365" name=""/>
                     <pic:cNvPicPr/>
                   </pic:nvPicPr>
                   <pic:blipFill>
@@ -1810,7 +2095,7 @@
                   <pic:spPr>
                     <a:xfrm>
                       <a:off x="0" y="0"/>
-                      <a:ext cx="5731510" cy="772795"/>
+                      <a:ext cx="5731510" cy="4093845"/>
                     </a:xfrm>
                     <a:prstGeom prst="rect">
                       <a:avLst/>
@@ -1825,6 +2110,496 @@
     </w:p>
     <w:p>
       <w:pPr>
+        <w:rPr>
+          <w:sz w:val="28"/>
+          <w:szCs w:val="28"/>
+        </w:rPr>
+      </w:pPr>
+      <w:r>
+        <w:t>Result:The program is executed successfully ,</w:t>
+      </w:r>
+      <w:r>
+        <w:t>taking input like temp and displayed</w:t>
+      </w:r>
+      <w:r>
+        <w:t xml:space="preserve"> max and min on which day.</w:t>
+      </w:r>
+    </w:p>
+    <w:p>
+      <w:pPr>
+        <w:rPr>
+          <w:sz w:val="28"/>
+          <w:szCs w:val="28"/>
+        </w:rPr>
+      </w:pPr>
+    </w:p>
+    <w:p>
+      <w:pPr>
+        <w:rPr>
+          <w:sz w:val="28"/>
+          <w:szCs w:val="28"/>
+        </w:rPr>
+      </w:pPr>
+      <w:r>
+        <w:rPr>
+          <w:sz w:val="28"/>
+          <w:szCs w:val="28"/>
+        </w:rPr>
+        <w:t>Questi</w:t>
+      </w:r>
+      <w:r>
+        <w:rPr>
+          <w:sz w:val="28"/>
+          <w:szCs w:val="28"/>
+        </w:rPr>
+        <w:t>o</w:t>
+      </w:r>
+      <w:r>
+        <w:rPr>
+          <w:sz w:val="28"/>
+          <w:szCs w:val="28"/>
+        </w:rPr>
+        <w:t>n</w:t>
+      </w:r>
+      <w:r>
+        <w:rPr>
+          <w:sz w:val="28"/>
+          <w:szCs w:val="28"/>
+        </w:rPr>
+        <w:t xml:space="preserve"> 5:</w:t>
+      </w:r>
+      <w:r>
+        <w:rPr>
+          <w:sz w:val="28"/>
+          <w:szCs w:val="28"/>
+        </w:rPr>
+        <w:t xml:space="preserve"> Write a Python program to remove duplicate elements from a list by preserving the order.</w:t>
+      </w:r>
+    </w:p>
+    <w:p>
+      <w:pPr>
+        <w:rPr>
+          <w:sz w:val="28"/>
+          <w:szCs w:val="28"/>
+        </w:rPr>
+      </w:pPr>
+      <w:r>
+        <w:rPr>
+          <w:sz w:val="28"/>
+          <w:szCs w:val="28"/>
+        </w:rPr>
+        <w:t>Program,Input&amp;Output:</w:t>
+      </w:r>
+    </w:p>
+    <w:p>
+      <w:pPr>
+        <w:rPr>
+          <w:sz w:val="28"/>
+          <w:szCs w:val="28"/>
+        </w:rPr>
+      </w:pPr>
+      <w:r>
+        <w:rPr>
+          <w:sz w:val="28"/>
+          <w:szCs w:val="28"/>
+        </w:rPr>
+        <w:lastRenderedPageBreak/>
+        <w:drawing>
+          <wp:inline distT="0" distB="0" distL="0" distR="0" wp14:anchorId="4356B212" wp14:editId="1C197E98">
+            <wp:extent cx="5731510" cy="4288155"/>
+            <wp:effectExtent l="0" t="0" r="2540" b="0"/>
+            <wp:docPr id="1323099811" name="Picture 1"/>
+            <wp:cNvGraphicFramePr>
+              <a:graphicFrameLocks xmlns:a="http://schemas.openxmlformats.org/drawingml/2006/main" noChangeAspect="1"/>
+            </wp:cNvGraphicFramePr>
+            <a:graphic xmlns:a="http://schemas.openxmlformats.org/drawingml/2006/main">
+              <a:graphicData uri="http://schemas.openxmlformats.org/drawingml/2006/picture">
+                <pic:pic xmlns:pic="http://schemas.openxmlformats.org/drawingml/2006/picture">
+                  <pic:nvPicPr>
+                    <pic:cNvPr id="1323099811" name=""/>
+                    <pic:cNvPicPr/>
+                  </pic:nvPicPr>
+                  <pic:blipFill>
+                    <a:blip r:embed="rId15"/>
+                    <a:stretch>
+                      <a:fillRect/>
+                    </a:stretch>
+                  </pic:blipFill>
+                  <pic:spPr>
+                    <a:xfrm>
+                      <a:off x="0" y="0"/>
+                      <a:ext cx="5731510" cy="4288155"/>
+                    </a:xfrm>
+                    <a:prstGeom prst="rect">
+                      <a:avLst/>
+                    </a:prstGeom>
+                  </pic:spPr>
+                </pic:pic>
+              </a:graphicData>
+            </a:graphic>
+          </wp:inline>
+        </w:drawing>
+      </w:r>
+    </w:p>
+    <w:p>
+      <w:pPr>
+        <w:rPr>
+          <w:sz w:val="28"/>
+          <w:szCs w:val="28"/>
+        </w:rPr>
+      </w:pPr>
+      <w:r>
+        <w:t>Result:The program is executed successfully ,</w:t>
+      </w:r>
+      <w:r>
+        <w:t>by removing duplicates</w:t>
+      </w:r>
+      <w:r>
+        <w:t xml:space="preserve"> from list.</w:t>
+      </w:r>
+    </w:p>
+    <w:p>
+      <w:pPr>
+        <w:rPr>
+          <w:sz w:val="28"/>
+          <w:szCs w:val="28"/>
+        </w:rPr>
+      </w:pPr>
+    </w:p>
+    <w:p>
+      <w:pPr>
+        <w:rPr>
+          <w:sz w:val="28"/>
+          <w:szCs w:val="28"/>
+        </w:rPr>
+      </w:pPr>
+      <w:r>
+        <w:rPr>
+          <w:sz w:val="28"/>
+          <w:szCs w:val="28"/>
+        </w:rPr>
+        <w:t>Question-6:</w:t>
+      </w:r>
+      <w:r>
+        <w:rPr>
+          <w:sz w:val="28"/>
+          <w:szCs w:val="28"/>
+        </w:rPr>
+        <w:t xml:space="preserve"> </w:t>
+      </w:r>
+      <w:r>
+        <w:rPr>
+          <w:sz w:val="28"/>
+          <w:szCs w:val="28"/>
+        </w:rPr>
+        <w:t>Create a program that manages a grocery shopping list</w:t>
+      </w:r>
+    </w:p>
+    <w:p>
+      <w:pPr>
+        <w:rPr>
+          <w:sz w:val="28"/>
+          <w:szCs w:val="28"/>
+        </w:rPr>
+      </w:pPr>
+      <w:r>
+        <w:rPr>
+          <w:sz w:val="28"/>
+          <w:szCs w:val="28"/>
+        </w:rPr>
+        <w:t>Program,Input&amp;Output:</w:t>
+      </w:r>
+    </w:p>
+    <w:p>
+      <w:pPr>
+        <w:rPr>
+          <w:sz w:val="28"/>
+          <w:szCs w:val="28"/>
+        </w:rPr>
+      </w:pPr>
+      <w:r>
+        <w:rPr>
+          <w:sz w:val="28"/>
+          <w:szCs w:val="28"/>
+        </w:rPr>
+        <w:lastRenderedPageBreak/>
+        <w:drawing>
+          <wp:inline distT="0" distB="0" distL="0" distR="0" wp14:anchorId="7CC1A889" wp14:editId="38E2D8AE">
+            <wp:extent cx="5645150" cy="3311236"/>
+            <wp:effectExtent l="0" t="0" r="0" b="3810"/>
+            <wp:docPr id="986988762" name="Picture 1"/>
+            <wp:cNvGraphicFramePr>
+              <a:graphicFrameLocks xmlns:a="http://schemas.openxmlformats.org/drawingml/2006/main" noChangeAspect="1"/>
+            </wp:cNvGraphicFramePr>
+            <a:graphic xmlns:a="http://schemas.openxmlformats.org/drawingml/2006/main">
+              <a:graphicData uri="http://schemas.openxmlformats.org/drawingml/2006/picture">
+                <pic:pic xmlns:pic="http://schemas.openxmlformats.org/drawingml/2006/picture">
+                  <pic:nvPicPr>
+                    <pic:cNvPr id="986988762" name=""/>
+                    <pic:cNvPicPr/>
+                  </pic:nvPicPr>
+                  <pic:blipFill>
+                    <a:blip r:embed="rId16"/>
+                    <a:stretch>
+                      <a:fillRect/>
+                    </a:stretch>
+                  </pic:blipFill>
+                  <pic:spPr>
+                    <a:xfrm>
+                      <a:off x="0" y="0"/>
+                      <a:ext cx="5669962" cy="3325790"/>
+                    </a:xfrm>
+                    <a:prstGeom prst="rect">
+                      <a:avLst/>
+                    </a:prstGeom>
+                  </pic:spPr>
+                </pic:pic>
+              </a:graphicData>
+            </a:graphic>
+          </wp:inline>
+        </w:drawing>
+      </w:r>
+    </w:p>
+    <w:p>
+      <w:pPr>
+        <w:rPr>
+          <w:sz w:val="28"/>
+          <w:szCs w:val="28"/>
+        </w:rPr>
+      </w:pPr>
+      <w:r>
+        <w:t xml:space="preserve">Result:The program is executed successfully ,by </w:t>
+      </w:r>
+      <w:r>
+        <w:t>adding and removing list items</w:t>
+      </w:r>
+      <w:r>
+        <w:t>.</w:t>
+      </w:r>
+    </w:p>
+    <w:p>
+      <w:pPr>
+        <w:rPr>
+          <w:sz w:val="28"/>
+          <w:szCs w:val="28"/>
+        </w:rPr>
+      </w:pPr>
+      <w:r>
+        <w:rPr>
+          <w:sz w:val="28"/>
+          <w:szCs w:val="28"/>
+        </w:rPr>
+        <w:t>Program-7:</w:t>
+      </w:r>
+      <w:r>
+        <w:t xml:space="preserve"> </w:t>
+      </w:r>
+      <w:r>
+        <w:rPr>
+          <w:sz w:val="28"/>
+          <w:szCs w:val="28"/>
+        </w:rPr>
+        <w:t xml:space="preserve"> Write a menu-driven Python program to manage a list of books in a library</w:t>
+      </w:r>
+    </w:p>
+    <w:p>
+      <w:pPr>
+        <w:rPr>
+          <w:sz w:val="28"/>
+          <w:szCs w:val="28"/>
+        </w:rPr>
+      </w:pPr>
+      <w:r>
+        <w:rPr>
+          <w:sz w:val="28"/>
+          <w:szCs w:val="28"/>
+        </w:rPr>
+        <w:t>Program,Input&amp;Output:</w:t>
+      </w:r>
+    </w:p>
+    <w:p>
+      <w:pPr>
+        <w:rPr>
+          <w:sz w:val="28"/>
+          <w:szCs w:val="28"/>
+        </w:rPr>
+      </w:pPr>
+      <w:r>
+        <w:rPr>
+          <w:sz w:val="28"/>
+          <w:szCs w:val="28"/>
+        </w:rPr>
+        <w:lastRenderedPageBreak/>
+        <w:drawing>
+          <wp:inline distT="0" distB="0" distL="0" distR="0" wp14:anchorId="341AE991" wp14:editId="6BC04D3F">
+            <wp:extent cx="7820314" cy="4931585"/>
+            <wp:effectExtent l="0" t="0" r="9525" b="2540"/>
+            <wp:docPr id="1591118360" name="Picture 1"/>
+            <wp:cNvGraphicFramePr>
+              <a:graphicFrameLocks xmlns:a="http://schemas.openxmlformats.org/drawingml/2006/main" noChangeAspect="1"/>
+            </wp:cNvGraphicFramePr>
+            <a:graphic xmlns:a="http://schemas.openxmlformats.org/drawingml/2006/main">
+              <a:graphicData uri="http://schemas.openxmlformats.org/drawingml/2006/picture">
+                <pic:pic xmlns:pic="http://schemas.openxmlformats.org/drawingml/2006/picture">
+                  <pic:nvPicPr>
+                    <pic:cNvPr id="1591118360" name=""/>
+                    <pic:cNvPicPr/>
+                  </pic:nvPicPr>
+                  <pic:blipFill>
+                    <a:blip r:embed="rId17"/>
+                    <a:stretch>
+                      <a:fillRect/>
+                    </a:stretch>
+                  </pic:blipFill>
+                  <pic:spPr>
+                    <a:xfrm>
+                      <a:off x="0" y="0"/>
+                      <a:ext cx="7864941" cy="4959727"/>
+                    </a:xfrm>
+                    <a:prstGeom prst="rect">
+                      <a:avLst/>
+                    </a:prstGeom>
+                  </pic:spPr>
+                </pic:pic>
+              </a:graphicData>
+            </a:graphic>
+          </wp:inline>
+        </w:drawing>
+      </w:r>
+    </w:p>
+    <w:p>
+      <w:pPr>
+        <w:rPr>
+          <w:sz w:val="28"/>
+          <w:szCs w:val="28"/>
+        </w:rPr>
+      </w:pPr>
+      <w:r>
+        <w:t>Result:The program is executed successfully</w:t>
+      </w:r>
+      <w:r>
+        <w:t xml:space="preserve"> in form of menu driven form.</w:t>
+      </w:r>
+    </w:p>
+    <w:p>
+      <w:pPr>
+        <w:rPr>
+          <w:sz w:val="28"/>
+          <w:szCs w:val="28"/>
+        </w:rPr>
+      </w:pPr>
+    </w:p>
+    <w:p>
+      <w:pPr>
+        <w:rPr>
+          <w:sz w:val="28"/>
+          <w:szCs w:val="28"/>
+        </w:rPr>
+      </w:pPr>
+      <w:r>
+        <w:rPr>
+          <w:sz w:val="28"/>
+          <w:szCs w:val="28"/>
+        </w:rPr>
+        <w:t>Program-8:</w:t>
+      </w:r>
+      <w:r>
+        <w:rPr>
+          <w:sz w:val="28"/>
+          <w:szCs w:val="28"/>
+        </w:rPr>
+        <w:t xml:space="preserve">Write a Python program to demonstrate the use of list comprehension </w:t>
+      </w:r>
+    </w:p>
+    <w:p>
+      <w:pPr>
+        <w:rPr>
+          <w:sz w:val="28"/>
+          <w:szCs w:val="28"/>
+        </w:rPr>
+      </w:pPr>
+      <w:r>
+        <w:rPr>
+          <w:sz w:val="28"/>
+          <w:szCs w:val="28"/>
+        </w:rPr>
+        <w:t>Program,Input&amp;Output:</w:t>
+      </w:r>
+    </w:p>
+    <w:p>
+      <w:pPr>
+        <w:rPr>
+          <w:sz w:val="28"/>
+          <w:szCs w:val="28"/>
+        </w:rPr>
+      </w:pPr>
+      <w:r>
+        <w:rPr>
+          <w:sz w:val="28"/>
+          <w:szCs w:val="28"/>
+        </w:rPr>
+        <w:lastRenderedPageBreak/>
+        <w:drawing>
+          <wp:inline distT="0" distB="0" distL="0" distR="0" wp14:anchorId="3E147599" wp14:editId="424659EC">
+            <wp:extent cx="6809509" cy="3650615"/>
+            <wp:effectExtent l="0" t="0" r="0" b="6985"/>
+            <wp:docPr id="1309299224" name="Picture 1"/>
+            <wp:cNvGraphicFramePr>
+              <a:graphicFrameLocks xmlns:a="http://schemas.openxmlformats.org/drawingml/2006/main" noChangeAspect="1"/>
+            </wp:cNvGraphicFramePr>
+            <a:graphic xmlns:a="http://schemas.openxmlformats.org/drawingml/2006/main">
+              <a:graphicData uri="http://schemas.openxmlformats.org/drawingml/2006/picture">
+                <pic:pic xmlns:pic="http://schemas.openxmlformats.org/drawingml/2006/picture">
+                  <pic:nvPicPr>
+                    <pic:cNvPr id="1309299224" name=""/>
+                    <pic:cNvPicPr/>
+                  </pic:nvPicPr>
+                  <pic:blipFill>
+                    <a:blip r:embed="rId18"/>
+                    <a:stretch>
+                      <a:fillRect/>
+                    </a:stretch>
+                  </pic:blipFill>
+                  <pic:spPr>
+                    <a:xfrm>
+                      <a:off x="0" y="0"/>
+                      <a:ext cx="6826944" cy="3659962"/>
+                    </a:xfrm>
+                    <a:prstGeom prst="rect">
+                      <a:avLst/>
+                    </a:prstGeom>
+                  </pic:spPr>
+                </pic:pic>
+              </a:graphicData>
+            </a:graphic>
+          </wp:inline>
+        </w:drawing>
+      </w:r>
+    </w:p>
+    <w:p>
+      <w:pPr>
+        <w:rPr>
+          <w:sz w:val="28"/>
+          <w:szCs w:val="28"/>
+        </w:rPr>
+      </w:pPr>
+      <w:r>
+        <w:t xml:space="preserve">Result:The program is executed successfully </w:t>
+      </w:r>
+      <w:r>
+        <w:t>and known the list comprehension.</w:t>
+      </w:r>
+    </w:p>
+    <w:p>
+      <w:pPr>
+        <w:rPr>
+          <w:sz w:val="28"/>
+          <w:szCs w:val="28"/>
+        </w:rPr>
+      </w:pPr>
+    </w:p>
+    <w:p>
+      <w:pPr>
         <w:tabs>
           <w:tab w:val="left" w:pos="3110"/>
         </w:tabs>
@@ -1842,7 +2617,7 @@
           <w:sz w:val="24"/>
           <w:szCs w:val="24"/>
         </w:rPr>
-        <w:t>4. Observations</w:t>
+        <w:t>5. Overall Result</w:t>
       </w:r>
     </w:p>
     <w:p>
@@ -1851,80 +2626,30 @@
           <w:tab w:val="left" w:pos="3110"/>
         </w:tabs>
         <w:rPr>
-          <w:b/>
-          <w:bCs/>
-          <w:sz w:val="24"/>
-          <w:szCs w:val="24"/>
-        </w:rPr>
-      </w:pPr>
-      <w:r>
-        <w:rPr>
-          <w:b/>
-          <w:bCs/>
-          <w:sz w:val="24"/>
-          <w:szCs w:val="24"/>
-        </w:rPr>
-        <w:t>Imported “random</w:t>
-      </w:r>
-      <w:proofErr w:type="gramStart"/>
-      <w:r>
-        <w:rPr>
-          <w:b/>
-          <w:bCs/>
-          <w:sz w:val="24"/>
-          <w:szCs w:val="24"/>
-        </w:rPr>
-        <w:t>” ,and</w:t>
-      </w:r>
-      <w:proofErr w:type="gramEnd"/>
-      <w:r>
-        <w:rPr>
-          <w:b/>
-          <w:bCs/>
-          <w:sz w:val="24"/>
-          <w:szCs w:val="24"/>
-        </w:rPr>
-        <w:t xml:space="preserve"> used </w:t>
-      </w:r>
-      <w:proofErr w:type="spellStart"/>
-      <w:proofErr w:type="gramStart"/>
-      <w:r>
-        <w:rPr>
-          <w:b/>
-          <w:bCs/>
-          <w:sz w:val="24"/>
-          <w:szCs w:val="24"/>
-        </w:rPr>
-        <w:t>randint</w:t>
-      </w:r>
-      <w:proofErr w:type="spellEnd"/>
-      <w:r>
-        <w:rPr>
-          <w:b/>
-          <w:bCs/>
-          <w:sz w:val="24"/>
-          <w:szCs w:val="24"/>
-        </w:rPr>
-        <w:t>(</w:t>
-      </w:r>
-      <w:proofErr w:type="gramEnd"/>
-      <w:r>
-        <w:rPr>
-          <w:b/>
-          <w:bCs/>
-          <w:sz w:val="24"/>
-          <w:szCs w:val="24"/>
-        </w:rPr>
-        <w:t>)</w:t>
-      </w:r>
-      <w:r>
-        <w:rPr>
-          <w:b/>
-          <w:bCs/>
-          <w:sz w:val="24"/>
-          <w:szCs w:val="24"/>
-        </w:rPr>
-        <w:t xml:space="preserve"> function to generate a random integer.</w:t>
+          <w:sz w:val="28"/>
+          <w:szCs w:val="28"/>
+        </w:rPr>
+      </w:pPr>
+      <w:r>
+        <w:rPr>
+          <w:sz w:val="28"/>
+          <w:szCs w:val="28"/>
+        </w:rPr>
+        <w:t xml:space="preserve">All 4 programs Executed Successfully </w:t>
+      </w:r>
+      <w:r>
+        <w:rPr>
+          <w:sz w:val="28"/>
+          <w:szCs w:val="28"/>
+        </w:rPr>
+        <w:t xml:space="preserve">used while and if elif in necessary </w:t>
+      </w:r>
+      <w:r>
+        <w:rPr>
+          <w:sz w:val="28"/>
+          <w:szCs w:val="28"/>
+        </w:rPr>
+        <w:t>conditions.</w:t>
       </w:r>
     </w:p>
     <w:p>
@@ -1933,30 +2658,10 @@
           <w:tab w:val="left" w:pos="3110"/>
         </w:tabs>
         <w:rPr>
-          <w:b/>
-          <w:bCs/>
-          <w:sz w:val="24"/>
-          <w:szCs w:val="24"/>
-        </w:rPr>
-      </w:pPr>
-      <w:r>
-        <w:rPr>
-          <w:b/>
-          <w:bCs/>
-          <w:sz w:val="24"/>
-          <w:szCs w:val="24"/>
-        </w:rPr>
-        <w:t xml:space="preserve">And loop exits when condition fails </w:t>
-      </w:r>
-      <w:r>
-        <w:rPr>
-          <w:b/>
-          <w:bCs/>
-          <w:sz w:val="24"/>
-          <w:szCs w:val="24"/>
-        </w:rPr>
-        <w:t>or break.</w:t>
-      </w:r>
+          <w:sz w:val="28"/>
+          <w:szCs w:val="28"/>
+        </w:rPr>
+      </w:pPr>
     </w:p>
     <w:p>
       <w:pPr>
@@ -1964,87 +2669,6 @@
           <w:tab w:val="left" w:pos="3110"/>
         </w:tabs>
         <w:rPr>
-          <w:b/>
-          <w:bCs/>
-          <w:sz w:val="24"/>
-          <w:szCs w:val="24"/>
-        </w:rPr>
-      </w:pPr>
-      <w:r>
-        <w:rPr>
-          <w:b/>
-          <w:bCs/>
-          <w:sz w:val="24"/>
-          <w:szCs w:val="24"/>
-        </w:rPr>
-        <w:t>5. Overall Result</w:t>
-      </w:r>
-    </w:p>
-    <w:p>
-      <w:pPr>
-        <w:tabs>
-          <w:tab w:val="left" w:pos="3110"/>
-        </w:tabs>
-        <w:rPr>
-          <w:sz w:val="28"/>
-          <w:szCs w:val="28"/>
-        </w:rPr>
-      </w:pPr>
-      <w:r>
-        <w:rPr>
-          <w:sz w:val="28"/>
-          <w:szCs w:val="28"/>
-        </w:rPr>
-        <w:t xml:space="preserve">All 4 programs Executed Successfully </w:t>
-      </w:r>
-      <w:r>
-        <w:rPr>
-          <w:sz w:val="28"/>
-          <w:szCs w:val="28"/>
-        </w:rPr>
-        <w:t xml:space="preserve">used while and if </w:t>
-      </w:r>
-      <w:proofErr w:type="spellStart"/>
-      <w:r>
-        <w:rPr>
-          <w:sz w:val="28"/>
-          <w:szCs w:val="28"/>
-        </w:rPr>
-        <w:t>elif</w:t>
-      </w:r>
-      <w:proofErr w:type="spellEnd"/>
-      <w:r>
-        <w:rPr>
-          <w:sz w:val="28"/>
-          <w:szCs w:val="28"/>
-        </w:rPr>
-        <w:t xml:space="preserve"> in necessary </w:t>
-      </w:r>
-      <w:r>
-        <w:rPr>
-          <w:sz w:val="28"/>
-          <w:szCs w:val="28"/>
-        </w:rPr>
-        <w:t>conditions.</w:t>
-      </w:r>
-    </w:p>
-    <w:p>
-      <w:pPr>
-        <w:tabs>
-          <w:tab w:val="left" w:pos="3110"/>
-        </w:tabs>
-        <w:rPr>
-          <w:sz w:val="28"/>
-          <w:szCs w:val="28"/>
-        </w:rPr>
-      </w:pPr>
-    </w:p>
-    <w:p>
-      <w:pPr>
-        <w:tabs>
-          <w:tab w:val="left" w:pos="3110"/>
-        </w:tabs>
-        <w:rPr>
           <w:sz w:val="28"/>
           <w:szCs w:val="28"/>
         </w:rPr>
@@ -2060,7 +2684,7 @@
     </w:p>
     <w:p/>
     <w:sectPr>
-      <w:headerReference w:type="default" r:id="rId15"/>
+      <w:headerReference w:type="default" r:id="rId19"/>
       <w:pgSz w:w="11906" w:h="16838"/>
       <w:pgMar w:top="1440" w:right="1440" w:bottom="1440" w:left="1440" w:header="708" w:footer="708" w:gutter="0"/>
       <w:pgBorders w:offsetFrom="page">
@@ -2077,7 +2701,7 @@
 </file>
 
 <file path=word/endnotes.xml><?xml version="1.0" encoding="utf-8"?>
-<w:endnotes xmlns:wpc="http://schemas.microsoft.com/office/word/2010/wordprocessingCanvas" xmlns:cx="http://schemas.microsoft.com/office/drawing/2014/chartex" xmlns:cx1="http://schemas.microsoft.com/office/drawing/2015/9/8/chartex" xmlns:cx2="http://schemas.microsoft.com/office/drawing/2015/10/21/chartex" xmlns:cx3="http://schemas.microsoft.com/office/drawing/2016/5/9/chartex" xmlns:cx4="http://schemas.microsoft.com/office/drawing/2016/5/10/chartex" xmlns:cx5="http://schemas.microsoft.com/office/drawing/2016/5/11/chartex" xmlns:cx6="http://schemas.microsoft.com/office/drawing/2016/5/12/chartex" xmlns:cx7="http://schemas.microsoft.com/office/drawing/2016/5/13/chartex" xmlns:cx8="http://schemas.microsoft.com/office/drawing/2016/5/14/chartex" xmlns:mc="http://schemas.openxmlformats.org/markup-compatibility/2006" xmlns:aink="http://schemas.microsoft.com/office/drawing/2016/ink" xmlns:am3d="http://schemas.microsoft.com/office/drawing/2017/model3d" xmlns:o="urn:schemas-microsoft-com:office:office" xmlns:oel="http://schemas.microsoft.com/office/2019/extlst" xmlns:r="http://schemas.openxmlformats.org/officeDocument/2006/relationships" xmlns:m="http://schemas.openxmlformats.org/officeDocument/2006/math" xmlns:v="urn:schemas-microsoft-com:vml" xmlns:wp14="http://schemas.microsoft.com/office/word/2010/wordprocessingDrawing" xmlns:wp="http://schemas.openxmlformats.org/drawingml/2006/wordprocessingDrawing" xmlns:w10="urn:schemas-microsoft-com:office:word" xmlns:w="http://schemas.openxmlformats.org/wordprocessingml/2006/main" xmlns:w14="http://schemas.microsoft.com/office/word/2010/wordml" xmlns:w15="http://schemas.microsoft.com/office/word/2012/wordml" xmlns:w16cex="http://schemas.microsoft.com/office/word/2018/wordml/cex" xmlns:w16cid="http://schemas.microsoft.com/office/word/2016/wordml/cid" xmlns:w16="http://schemas.microsoft.com/office/word/2018/wordml" xmlns:w16du="http://schemas.microsoft.com/office/word/2023/wordml/word16du" xmlns:w16sdtdh="http://schemas.microsoft.com/office/word/2020/wordml/sdtdatahash" xmlns:w16sdtfl="http://schemas.microsoft.com/office/word/2024/wordml/sdtformatlock" xmlns:w16se="http://schemas.microsoft.com/office/word/2015/wordml/symex" xmlns:wpg="http://schemas.microsoft.com/office/word/2010/wordprocessingGroup" xmlns:wpi="http://schemas.microsoft.com/office/word/2010/wordprocessingInk" xmlns:wne="http://schemas.microsoft.com/office/word/2006/wordml" xmlns:wps="http://schemas.microsoft.com/office/word/2010/wordprocessingShape" mc:Ignorable="w14 w15 w16se w16cid w16 w16cex w16sdtdh w16sdtfl w16du wp14">
+<w:endnotes xmlns:wpc="http://schemas.microsoft.com/office/word/2010/wordprocessingCanvas" xmlns:cx="http://schemas.microsoft.com/office/drawing/2014/chartex" xmlns:cx1="http://schemas.microsoft.com/office/drawing/2015/9/8/chartex" xmlns:cx2="http://schemas.microsoft.com/office/drawing/2015/10/21/chartex" xmlns:cx3="http://schemas.microsoft.com/office/drawing/2016/5/9/chartex" xmlns:cx4="http://schemas.microsoft.com/office/drawing/2016/5/10/chartex" xmlns:cx5="http://schemas.microsoft.com/office/drawing/2016/5/11/chartex" xmlns:cx6="http://schemas.microsoft.com/office/drawing/2016/5/12/chartex" xmlns:cx7="http://schemas.microsoft.com/office/drawing/2016/5/13/chartex" xmlns:cx8="http://schemas.microsoft.com/office/drawing/2016/5/14/chartex" xmlns:mc="http://schemas.openxmlformats.org/markup-compatibility/2006" xmlns:aink="http://schemas.microsoft.com/office/drawing/2016/ink" xmlns:am3d="http://schemas.microsoft.com/office/drawing/2017/model3d" xmlns:o="urn:schemas-microsoft-com:office:office" xmlns:oel="http://schemas.microsoft.com/office/2019/extlst" xmlns:r="http://schemas.openxmlformats.org/officeDocument/2006/relationships" xmlns:m="http://schemas.openxmlformats.org/officeDocument/2006/math" xmlns:v="urn:schemas-microsoft-com:vml" xmlns:wp14="http://schemas.microsoft.com/office/word/2010/wordprocessingDrawing" xmlns:wp="http://schemas.openxmlformats.org/drawingml/2006/wordprocessingDrawing" xmlns:w10="urn:schemas-microsoft-com:office:word" xmlns:w="http://schemas.openxmlformats.org/wordprocessingml/2006/main" xmlns:w14="http://schemas.microsoft.com/office/word/2010/wordml" xmlns:w15="http://schemas.microsoft.com/office/word/2012/wordml" xmlns:w16cei="http://schemas.microsoft.com/office/word/2026/wordml/cei" xmlns:w16cex="http://schemas.microsoft.com/office/word/2018/wordml/cex" xmlns:w16cid="http://schemas.microsoft.com/office/word/2016/wordml/cid" xmlns:w16="http://schemas.microsoft.com/office/word/2018/wordml" xmlns:w16du="http://schemas.microsoft.com/office/word/2023/wordml/word16du" xmlns:w16sdtdh="http://schemas.microsoft.com/office/word/2020/wordml/sdtdatahash" xmlns:w16sdtfl="http://schemas.microsoft.com/office/word/2024/wordml/sdtformatlock" xmlns:w16se="http://schemas.microsoft.com/office/word/2015/wordml/symex" xmlns:wpg="http://schemas.microsoft.com/office/word/2010/wordprocessingGroup" xmlns:wpi="http://schemas.microsoft.com/office/word/2010/wordprocessingInk" xmlns:wne="http://schemas.microsoft.com/office/word/2006/wordml" xmlns:wps="http://schemas.microsoft.com/office/word/2010/wordprocessingShape" mc:Ignorable="w14 w15 w16se w16cid w16 w16cex w16sdtdh w16sdtfl w16du wp14">
   <w:endnote w:type="separator" w:id="-1">
     <w:p>
       <w:pPr>
@@ -2102,7 +2726,7 @@
 </file>
 
 <file path=word/footnotes.xml><?xml version="1.0" encoding="utf-8"?>
-<w:footnotes xmlns:wpc="http://schemas.microsoft.com/office/word/2010/wordprocessingCanvas" xmlns:cx="http://schemas.microsoft.com/office/drawing/2014/chartex" xmlns:cx1="http://schemas.microsoft.com/office/drawing/2015/9/8/chartex" xmlns:cx2="http://schemas.microsoft.com/office/drawing/2015/10/21/chartex" xmlns:cx3="http://schemas.microsoft.com/office/drawing/2016/5/9/chartex" xmlns:cx4="http://schemas.microsoft.com/office/drawing/2016/5/10/chartex" xmlns:cx5="http://schemas.microsoft.com/office/drawing/2016/5/11/chartex" xmlns:cx6="http://schemas.microsoft.com/office/drawing/2016/5/12/chartex" xmlns:cx7="http://schemas.microsoft.com/office/drawing/2016/5/13/chartex" xmlns:cx8="http://schemas.microsoft.com/office/drawing/2016/5/14/chartex" xmlns:mc="http://schemas.openxmlformats.org/markup-compatibility/2006" xmlns:aink="http://schemas.microsoft.com/office/drawing/2016/ink" xmlns:am3d="http://schemas.microsoft.com/office/drawing/2017/model3d" xmlns:o="urn:schemas-microsoft-com:office:office" xmlns:oel="http://schemas.microsoft.com/office/2019/extlst" xmlns:r="http://schemas.openxmlformats.org/officeDocument/2006/relationships" xmlns:m="http://schemas.openxmlformats.org/officeDocument/2006/math" xmlns:v="urn:schemas-microsoft-com:vml" xmlns:wp14="http://schemas.microsoft.com/office/word/2010/wordprocessingDrawing" xmlns:wp="http://schemas.openxmlformats.org/drawingml/2006/wordprocessingDrawing" xmlns:w10="urn:schemas-microsoft-com:office:word" xmlns:w="http://schemas.openxmlformats.org/wordprocessingml/2006/main" xmlns:w14="http://schemas.microsoft.com/office/word/2010/wordml" xmlns:w15="http://schemas.microsoft.com/office/word/2012/wordml" xmlns:w16cex="http://schemas.microsoft.com/office/word/2018/wordml/cex" xmlns:w16cid="http://schemas.microsoft.com/office/word/2016/wordml/cid" xmlns:w16="http://schemas.microsoft.com/office/word/2018/wordml" xmlns:w16du="http://schemas.microsoft.com/office/word/2023/wordml/word16du" xmlns:w16sdtdh="http://schemas.microsoft.com/office/word/2020/wordml/sdtdatahash" xmlns:w16sdtfl="http://schemas.microsoft.com/office/word/2024/wordml/sdtformatlock" xmlns:w16se="http://schemas.microsoft.com/office/word/2015/wordml/symex" xmlns:wpg="http://schemas.microsoft.com/office/word/2010/wordprocessingGroup" xmlns:wpi="http://schemas.microsoft.com/office/word/2010/wordprocessingInk" xmlns:wne="http://schemas.microsoft.com/office/word/2006/wordml" xmlns:wps="http://schemas.microsoft.com/office/word/2010/wordprocessingShape" mc:Ignorable="w14 w15 w16se w16cid w16 w16cex w16sdtdh w16sdtfl w16du wp14">
+<w:footnotes xmlns:wpc="http://schemas.microsoft.com/office/word/2010/wordprocessingCanvas" xmlns:cx="http://schemas.microsoft.com/office/drawing/2014/chartex" xmlns:cx1="http://schemas.microsoft.com/office/drawing/2015/9/8/chartex" xmlns:cx2="http://schemas.microsoft.com/office/drawing/2015/10/21/chartex" xmlns:cx3="http://schemas.microsoft.com/office/drawing/2016/5/9/chartex" xmlns:cx4="http://schemas.microsoft.com/office/drawing/2016/5/10/chartex" xmlns:cx5="http://schemas.microsoft.com/office/drawing/2016/5/11/chartex" xmlns:cx6="http://schemas.microsoft.com/office/drawing/2016/5/12/chartex" xmlns:cx7="http://schemas.microsoft.com/office/drawing/2016/5/13/chartex" xmlns:cx8="http://schemas.microsoft.com/office/drawing/2016/5/14/chartex" xmlns:mc="http://schemas.openxmlformats.org/markup-compatibility/2006" xmlns:aink="http://schemas.microsoft.com/office/drawing/2016/ink" xmlns:am3d="http://schemas.microsoft.com/office/drawing/2017/model3d" xmlns:o="urn:schemas-microsoft-com:office:office" xmlns:oel="http://schemas.microsoft.com/office/2019/extlst" xmlns:r="http://schemas.openxmlformats.org/officeDocument/2006/relationships" xmlns:m="http://schemas.openxmlformats.org/officeDocument/2006/math" xmlns:v="urn:schemas-microsoft-com:vml" xmlns:wp14="http://schemas.microsoft.com/office/word/2010/wordprocessingDrawing" xmlns:wp="http://schemas.openxmlformats.org/drawingml/2006/wordprocessingDrawing" xmlns:w10="urn:schemas-microsoft-com:office:word" xmlns:w="http://schemas.openxmlformats.org/wordprocessingml/2006/main" xmlns:w14="http://schemas.microsoft.com/office/word/2010/wordml" xmlns:w15="http://schemas.microsoft.com/office/word/2012/wordml" xmlns:w16cei="http://schemas.microsoft.com/office/word/2026/wordml/cei" xmlns:w16cex="http://schemas.microsoft.com/office/word/2018/wordml/cex" xmlns:w16cid="http://schemas.microsoft.com/office/word/2016/wordml/cid" xmlns:w16="http://schemas.microsoft.com/office/word/2018/wordml" xmlns:w16du="http://schemas.microsoft.com/office/word/2023/wordml/word16du" xmlns:w16sdtdh="http://schemas.microsoft.com/office/word/2020/wordml/sdtdatahash" xmlns:w16sdtfl="http://schemas.microsoft.com/office/word/2024/wordml/sdtformatlock" xmlns:w16se="http://schemas.microsoft.com/office/word/2015/wordml/symex" xmlns:wpg="http://schemas.microsoft.com/office/word/2010/wordprocessingGroup" xmlns:wpi="http://schemas.microsoft.com/office/word/2010/wordprocessingInk" xmlns:wne="http://schemas.microsoft.com/office/word/2006/wordml" xmlns:wps="http://schemas.microsoft.com/office/word/2010/wordprocessingShape" mc:Ignorable="w14 w15 w16se w16cid w16 w16cex w16sdtdh w16sdtfl w16du wp14">
   <w:footnote w:type="separator" w:id="-1">
     <w:p>
       <w:pPr>
@@ -2127,7 +2751,7 @@
 </file>
 
 <file path=word/header1.xml><?xml version="1.0" encoding="utf-8"?>
-<w:hdr xmlns:wpc="http://schemas.microsoft.com/office/word/2010/wordprocessingCanvas" xmlns:cx="http://schemas.microsoft.com/office/drawing/2014/chartex" xmlns:cx1="http://schemas.microsoft.com/office/drawing/2015/9/8/chartex" xmlns:cx2="http://schemas.microsoft.com/office/drawing/2015/10/21/chartex" xmlns:cx3="http://schemas.microsoft.com/office/drawing/2016/5/9/chartex" xmlns:cx4="http://schemas.microsoft.com/office/drawing/2016/5/10/chartex" xmlns:cx5="http://schemas.microsoft.com/office/drawing/2016/5/11/chartex" xmlns:cx6="http://schemas.microsoft.com/office/drawing/2016/5/12/chartex" xmlns:cx7="http://schemas.microsoft.com/office/drawing/2016/5/13/chartex" xmlns:cx8="http://schemas.microsoft.com/office/drawing/2016/5/14/chartex" xmlns:mc="http://schemas.openxmlformats.org/markup-compatibility/2006" xmlns:aink="http://schemas.microsoft.com/office/drawing/2016/ink" xmlns:am3d="http://schemas.microsoft.com/office/drawing/2017/model3d" xmlns:o="urn:schemas-microsoft-com:office:office" xmlns:oel="http://schemas.microsoft.com/office/2019/extlst" xmlns:r="http://schemas.openxmlformats.org/officeDocument/2006/relationships" xmlns:m="http://schemas.openxmlformats.org/officeDocument/2006/math" xmlns:v="urn:schemas-microsoft-com:vml" xmlns:wp14="http://schemas.microsoft.com/office/word/2010/wordprocessingDrawing" xmlns:wp="http://schemas.openxmlformats.org/drawingml/2006/wordprocessingDrawing" xmlns:w10="urn:schemas-microsoft-com:office:word" xmlns:w="http://schemas.openxmlformats.org/wordprocessingml/2006/main" xmlns:w14="http://schemas.microsoft.com/office/word/2010/wordml" xmlns:w15="http://schemas.microsoft.com/office/word/2012/wordml" xmlns:w16cex="http://schemas.microsoft.com/office/word/2018/wordml/cex" xmlns:w16cid="http://schemas.microsoft.com/office/word/2016/wordml/cid" xmlns:w16="http://schemas.microsoft.com/office/word/2018/wordml" xmlns:w16du="http://schemas.microsoft.com/office/word/2023/wordml/word16du" xmlns:w16sdtdh="http://schemas.microsoft.com/office/word/2020/wordml/sdtdatahash" xmlns:w16sdtfl="http://schemas.microsoft.com/office/word/2024/wordml/sdtformatlock" xmlns:w16se="http://schemas.microsoft.com/office/word/2015/wordml/symex" xmlns:wpg="http://schemas.microsoft.com/office/word/2010/wordprocessingGroup" xmlns:wpi="http://schemas.microsoft.com/office/word/2010/wordprocessingInk" xmlns:wne="http://schemas.microsoft.com/office/word/2006/wordml" xmlns:wps="http://schemas.microsoft.com/office/word/2010/wordprocessingShape" mc:Ignorable="w14 w15 w16se w16cid w16 w16cex w16sdtdh w16sdtfl w16du wp14">
+<w:hdr xmlns:wpc="http://schemas.microsoft.com/office/word/2010/wordprocessingCanvas" xmlns:cx="http://schemas.microsoft.com/office/drawing/2014/chartex" xmlns:cx1="http://schemas.microsoft.com/office/drawing/2015/9/8/chartex" xmlns:cx2="http://schemas.microsoft.com/office/drawing/2015/10/21/chartex" xmlns:cx3="http://schemas.microsoft.com/office/drawing/2016/5/9/chartex" xmlns:cx4="http://schemas.microsoft.com/office/drawing/2016/5/10/chartex" xmlns:cx5="http://schemas.microsoft.com/office/drawing/2016/5/11/chartex" xmlns:cx6="http://schemas.microsoft.com/office/drawing/2016/5/12/chartex" xmlns:cx7="http://schemas.microsoft.com/office/drawing/2016/5/13/chartex" xmlns:cx8="http://schemas.microsoft.com/office/drawing/2016/5/14/chartex" xmlns:mc="http://schemas.openxmlformats.org/markup-compatibility/2006" xmlns:aink="http://schemas.microsoft.com/office/drawing/2016/ink" xmlns:am3d="http://schemas.microsoft.com/office/drawing/2017/model3d" xmlns:o="urn:schemas-microsoft-com:office:office" xmlns:oel="http://schemas.microsoft.com/office/2019/extlst" xmlns:r="http://schemas.openxmlformats.org/officeDocument/2006/relationships" xmlns:m="http://schemas.openxmlformats.org/officeDocument/2006/math" xmlns:v="urn:schemas-microsoft-com:vml" xmlns:wp14="http://schemas.microsoft.com/office/word/2010/wordprocessingDrawing" xmlns:wp="http://schemas.openxmlformats.org/drawingml/2006/wordprocessingDrawing" xmlns:w10="urn:schemas-microsoft-com:office:word" xmlns:w="http://schemas.openxmlformats.org/wordprocessingml/2006/main" xmlns:w14="http://schemas.microsoft.com/office/word/2010/wordml" xmlns:w15="http://schemas.microsoft.com/office/word/2012/wordml" xmlns:w16cei="http://schemas.microsoft.com/office/word/2026/wordml/cei" xmlns:w16cex="http://schemas.microsoft.com/office/word/2018/wordml/cex" xmlns:w16cid="http://schemas.microsoft.com/office/word/2016/wordml/cid" xmlns:w16="http://schemas.microsoft.com/office/word/2018/wordml" xmlns:w16du="http://schemas.microsoft.com/office/word/2023/wordml/word16du" xmlns:w16sdtdh="http://schemas.microsoft.com/office/word/2020/wordml/sdtdatahash" xmlns:w16sdtfl="http://schemas.microsoft.com/office/word/2024/wordml/sdtformatlock" xmlns:w16se="http://schemas.microsoft.com/office/word/2015/wordml/symex" xmlns:wpg="http://schemas.microsoft.com/office/word/2010/wordprocessingGroup" xmlns:wpi="http://schemas.microsoft.com/office/word/2010/wordprocessingInk" xmlns:wne="http://schemas.microsoft.com/office/word/2006/wordml" xmlns:wps="http://schemas.microsoft.com/office/word/2010/wordprocessingShape" mc:Ignorable="w14 w15 w16se w16cid w16 w16cex w16sdtdh w16sdtfl w16du wp14">
   <w:sdt>
     <w:sdtPr>
       <w:rPr>
@@ -2209,7 +2833,7 @@
 </file>
 
 <file path=word/numbering.xml><?xml version="1.0" encoding="utf-8"?>
-<w:numbering xmlns:wpc="http://schemas.microsoft.com/office/word/2010/wordprocessingCanvas" xmlns:cx="http://schemas.microsoft.com/office/drawing/2014/chartex" xmlns:cx1="http://schemas.microsoft.com/office/drawing/2015/9/8/chartex" xmlns:cx2="http://schemas.microsoft.com/office/drawing/2015/10/21/chartex" xmlns:cx3="http://schemas.microsoft.com/office/drawing/2016/5/9/chartex" xmlns:cx4="http://schemas.microsoft.com/office/drawing/2016/5/10/chartex" xmlns:cx5="http://schemas.microsoft.com/office/drawing/2016/5/11/chartex" xmlns:cx6="http://schemas.microsoft.com/office/drawing/2016/5/12/chartex" xmlns:cx7="http://schemas.microsoft.com/office/drawing/2016/5/13/chartex" xmlns:cx8="http://schemas.microsoft.com/office/drawing/2016/5/14/chartex" xmlns:mc="http://schemas.openxmlformats.org/markup-compatibility/2006" xmlns:aink="http://schemas.microsoft.com/office/drawing/2016/ink" xmlns:am3d="http://schemas.microsoft.com/office/drawing/2017/model3d" xmlns:o="urn:schemas-microsoft-com:office:office" xmlns:oel="http://schemas.microsoft.com/office/2019/extlst" xmlns:r="http://schemas.openxmlformats.org/officeDocument/2006/relationships" xmlns:m="http://schemas.openxmlformats.org/officeDocument/2006/math" xmlns:v="urn:schemas-microsoft-com:vml" xmlns:wp14="http://schemas.microsoft.com/office/word/2010/wordprocessingDrawing" xmlns:wp="http://schemas.openxmlformats.org/drawingml/2006/wordprocessingDrawing" xmlns:w10="urn:schemas-microsoft-com:office:word" xmlns:w="http://schemas.openxmlformats.org/wordprocessingml/2006/main" xmlns:w14="http://schemas.microsoft.com/office/word/2010/wordml" xmlns:w15="http://schemas.microsoft.com/office/word/2012/wordml" xmlns:w16cex="http://schemas.microsoft.com/office/word/2018/wordml/cex" xmlns:w16cid="http://schemas.microsoft.com/office/word/2016/wordml/cid" xmlns:w16="http://schemas.microsoft.com/office/word/2018/wordml" xmlns:w16du="http://schemas.microsoft.com/office/word/2023/wordml/word16du" xmlns:w16sdtdh="http://schemas.microsoft.com/office/word/2020/wordml/sdtdatahash" xmlns:w16sdtfl="http://schemas.microsoft.com/office/word/2024/wordml/sdtformatlock" xmlns:w16se="http://schemas.microsoft.com/office/word/2015/wordml/symex" xmlns:wpg="http://schemas.microsoft.com/office/word/2010/wordprocessingGroup" xmlns:wpi="http://schemas.microsoft.com/office/word/2010/wordprocessingInk" xmlns:wne="http://schemas.microsoft.com/office/word/2006/wordml" xmlns:wps="http://schemas.microsoft.com/office/word/2010/wordprocessingShape" mc:Ignorable="w14 w15 w16se w16cid w16 w16cex w16sdtdh w16sdtfl w16du wp14">
+<w:numbering xmlns:wpc="http://schemas.microsoft.com/office/word/2010/wordprocessingCanvas" xmlns:cx="http://schemas.microsoft.com/office/drawing/2014/chartex" xmlns:cx1="http://schemas.microsoft.com/office/drawing/2015/9/8/chartex" xmlns:cx2="http://schemas.microsoft.com/office/drawing/2015/10/21/chartex" xmlns:cx3="http://schemas.microsoft.com/office/drawing/2016/5/9/chartex" xmlns:cx4="http://schemas.microsoft.com/office/drawing/2016/5/10/chartex" xmlns:cx5="http://schemas.microsoft.com/office/drawing/2016/5/11/chartex" xmlns:cx6="http://schemas.microsoft.com/office/drawing/2016/5/12/chartex" xmlns:cx7="http://schemas.microsoft.com/office/drawing/2016/5/13/chartex" xmlns:cx8="http://schemas.microsoft.com/office/drawing/2016/5/14/chartex" xmlns:mc="http://schemas.openxmlformats.org/markup-compatibility/2006" xmlns:aink="http://schemas.microsoft.com/office/drawing/2016/ink" xmlns:am3d="http://schemas.microsoft.com/office/drawing/2017/model3d" xmlns:o="urn:schemas-microsoft-com:office:office" xmlns:oel="http://schemas.microsoft.com/office/2019/extlst" xmlns:r="http://schemas.openxmlformats.org/officeDocument/2006/relationships" xmlns:m="http://schemas.openxmlformats.org/officeDocument/2006/math" xmlns:v="urn:schemas-microsoft-com:vml" xmlns:wp14="http://schemas.microsoft.com/office/word/2010/wordprocessingDrawing" xmlns:wp="http://schemas.openxmlformats.org/drawingml/2006/wordprocessingDrawing" xmlns:w10="urn:schemas-microsoft-com:office:word" xmlns:w="http://schemas.openxmlformats.org/wordprocessingml/2006/main" xmlns:w14="http://schemas.microsoft.com/office/word/2010/wordml" xmlns:w15="http://schemas.microsoft.com/office/word/2012/wordml" xmlns:w16cei="http://schemas.microsoft.com/office/word/2026/wordml/cei" xmlns:w16cex="http://schemas.microsoft.com/office/word/2018/wordml/cex" xmlns:w16cid="http://schemas.microsoft.com/office/word/2016/wordml/cid" xmlns:w16="http://schemas.microsoft.com/office/word/2018/wordml" xmlns:w16du="http://schemas.microsoft.com/office/word/2023/wordml/word16du" xmlns:w16sdtdh="http://schemas.microsoft.com/office/word/2020/wordml/sdtdatahash" xmlns:w16sdtfl="http://schemas.microsoft.com/office/word/2024/wordml/sdtformatlock" xmlns:w16se="http://schemas.microsoft.com/office/word/2015/wordml/symex" xmlns:wpg="http://schemas.microsoft.com/office/word/2010/wordprocessingGroup" xmlns:wpi="http://schemas.microsoft.com/office/word/2010/wordprocessingInk" xmlns:wne="http://schemas.microsoft.com/office/word/2006/wordml" xmlns:wps="http://schemas.microsoft.com/office/word/2010/wordprocessingShape" mc:Ignorable="w14 w15 w16se w16cid w16 w16cex w16sdtdh w16sdtfl w16du wp14">
   <w:abstractNum w:abstractNumId="0" w15:restartNumberingAfterBreak="0">
     <w:nsid w:val="0AA21AFF"/>
     <w:multiLevelType w:val="multilevel"/>
@@ -2629,15 +3253,6 @@
   </w:num>
   <w:num w:numId="3" w16cid:durableId="2096439570">
     <w:abstractNumId w:val="2"/>
-    <w:lvlOverride w:ilvl="0"/>
-    <w:lvlOverride w:ilvl="1"/>
-    <w:lvlOverride w:ilvl="2"/>
-    <w:lvlOverride w:ilvl="3"/>
-    <w:lvlOverride w:ilvl="4"/>
-    <w:lvlOverride w:ilvl="5"/>
-    <w:lvlOverride w:ilvl="6"/>
-    <w:lvlOverride w:ilvl="7"/>
-    <w:lvlOverride w:ilvl="8"/>
   </w:num>
 </w:numbering>
 </file>
@@ -3042,7 +3657,7 @@
   <w:style w:type="paragraph" w:default="1" w:styleId="Normal">
     <w:name w:val="Normal"/>
     <w:qFormat/>
-    <w:rsid w:val="00C8261D"/>
+    <w:rsid w:val="00CA41C9"/>
   </w:style>
   <w:style w:type="paragraph" w:styleId="Heading1">
     <w:name w:val="heading 1"/>
@@ -3246,6 +3861,7 @@
   <w:style w:type="character" w:default="1" w:styleId="DefaultParagraphFont">
     <w:name w:val="Default Paragraph Font"/>
     <w:uiPriority w:val="1"/>
+    <w:semiHidden/>
     <w:unhideWhenUsed/>
   </w:style>
   <w:style w:type="table" w:default="1" w:styleId="TableNormal">
@@ -3622,6 +4238,25 @@
     <w:uiPriority w:val="99"/>
     <w:rsid w:val="00844224"/>
   </w:style>
+  <w:style w:type="paragraph" w:styleId="NormalWeb">
+    <w:name w:val="Normal (Web)"/>
+    <w:basedOn w:val="Normal"/>
+    <w:uiPriority w:val="99"/>
+    <w:semiHidden/>
+    <w:unhideWhenUsed/>
+    <w:rsid w:val="005243A8"/>
+    <w:pPr>
+      <w:spacing w:before="100" w:beforeAutospacing="1" w:after="100" w:afterAutospacing="1" w:line="240" w:lineRule="auto"/>
+    </w:pPr>
+    <w:rPr>
+      <w:rFonts w:ascii="Times New Roman" w:eastAsia="Times New Roman" w:hAnsi="Times New Roman" w:cs="Times New Roman"/>
+      <w:kern w:val="0"/>
+      <w:sz w:val="24"/>
+      <w:szCs w:val="24"/>
+      <w:lang w:eastAsia="en-IN"/>
+      <w14:ligatures w14:val="none"/>
+    </w:rPr>
+  </w:style>
 </w:styles>
 </file>
 

</xml_diff>